<commit_message>
Parking lot occupancy detector — PUCPR and UFPR04 complete
</commit_message>
<xml_diff>
--- a/docs/writeup.docx
+++ b/docs/writeup.docx
@@ -53,7 +53,7 @@
     </w:p>
     <w:p>
       <w:r>
-        <w:t>Test images are drawn from the PKLot dataset (De Almeida et al., 2015), which contains labeled overhead images from two Brazilian university campuses: UFPR (Universidade Federal do Paraná) and PUCPR (Pontifícia Universidade Católica do Paraná). This report focuses on the PUCPR parking lot, for which ROI tracing and threshold calibration are complete.</w:t>
+        <w:t>Test images are drawn from the PKLot dataset (De Almeida et al., 2015), which contains labeled overhead images from two Brazilian university campuses: UFPR (Universidade Federal do Paraná) and PUCPR (Pontifícia Universidade Católica do Paraná). ROI tracing and threshold calibration are complete for both lots.</w:t>
       </w:r>
     </w:p>
     <w:p>
@@ -539,7 +539,7 @@
           </w:tcPr>
           <w:p>
             <w:r>
-              <w:t>93</w:t>
+              <w:t>100</w:t>
             </w:r>
           </w:p>
         </w:tc>
@@ -549,7 +549,7 @@
           </w:tcPr>
           <w:p>
             <w:r>
-              <w:t>TBD</w:t>
+              <w:t>25.0</w:t>
             </w:r>
           </w:p>
         </w:tc>
@@ -559,7 +559,7 @@
           </w:tcPr>
           <w:p>
             <w:r>
-              <w:t>83</w:t>
+              <w:t>100</w:t>
             </w:r>
           </w:p>
         </w:tc>
@@ -569,7 +569,7 @@
           </w:tcPr>
           <w:p>
             <w:r>
-              <w:t>TBD</w:t>
+              <w:t>23.5</w:t>
             </w:r>
           </w:p>
         </w:tc>
@@ -589,7 +589,7 @@
     </w:p>
     <w:p>
       <w:r>
-        <w:t>PUCPR spaces are diagonally angled, so each ROI is defined as a quadrilateral polygon (four corner points) traced interactively using a custom OpenCV mouse-callback tool. The polygon mask ensures edge detection and variance are computed only within the actual space boundary, not the surrounding pavement or line markings. 43 spaces are defined for the PUCPR lot.</w:t>
+        <w:t>Each parking space ROI is defined as a quadrilateral polygon (four corner points) traced interactively using a custom OpenCV mouse-callback tool. Clicking four corners per space produces polygon coordinates that are pasted directly into the source code. The polygon mask ensures edge detection and variance are computed only within the actual space boundary, not the surrounding pavement or line markings. 43 spaces are defined for the PUCPR lot and 257 spaces for the UFPR04 lot.</w:t>
       </w:r>
     </w:p>
     <w:p>
@@ -605,7 +605,18 @@
     </w:p>
     <w:p>
       <w:r>
-        <w:t>Results are reported for three PUCPR images representing an empty lot, a partially occupied lot, and a heavily occupied lot. Thresholds were calibrated on PUCPR3.jpg.</w:t>
+        <w:t>Results are reported for three images per lot. Thresholds were calibrated on PUCPR3.jpg (PUCPR) and UFPR1.jpg (UFPR04), both mostly-empty reference images.</w:t>
+      </w:r>
+    </w:p>
+    <w:p>
+      <w:pPr>
+        <w:pStyle w:val="Heading2"/>
+      </w:pPr>
+      <w:r>
+        <w:rPr>
+          <w:color w:val="1F3864"/>
+        </w:rPr>
+        <w:t>PUCPR Lot</w:t>
       </w:r>
     </w:p>
     <w:tbl>
@@ -848,7 +859,261 @@
     <w:p/>
     <w:p>
       <w:r>
-        <w:t>PUCPR3 achieves zero false positives, confirming the threshold calibration is correct for empty spaces. For PUCPR1 and PUCPR2, classification errors remain due to the signal overlap described in Section 6. Annotated output images are included in the output/ directory.</w:t>
+        <w:t>PUCPR3 achieves zero false positives. For PUCPR1 and PUCPR2, minor classification errors remain due to signal overlap described in Section 6.</w:t>
+      </w:r>
+    </w:p>
+    <w:p>
+      <w:pPr>
+        <w:pStyle w:val="Heading2"/>
+      </w:pPr>
+      <w:r>
+        <w:rPr>
+          <w:color w:val="1F3864"/>
+        </w:rPr>
+        <w:t>UFPR04 Lot</w:t>
+      </w:r>
+    </w:p>
+    <w:tbl>
+      <w:tblPr>
+        <w:tblStyle w:val="TableGrid"/>
+        <w:tblW w:type="auto" w:w="0"/>
+        <w:tblLook w:firstColumn="1" w:firstRow="1" w:lastColumn="0" w:lastRow="0" w:noHBand="0" w:noVBand="1" w:val="04A0"/>
+      </w:tblPr>
+      <w:tblGrid>
+        <w:gridCol w:w="1728"/>
+        <w:gridCol w:w="1728"/>
+        <w:gridCol w:w="1728"/>
+        <w:gridCol w:w="1728"/>
+        <w:gridCol w:w="1728"/>
+      </w:tblGrid>
+      <w:tr>
+        <w:tc>
+          <w:tcPr>
+            <w:tcW w:type="dxa" w:w="1728"/>
+          </w:tcPr>
+          <w:p>
+            <w:r>
+              <w:rPr>
+                <w:b/>
+              </w:rPr>
+              <w:t>Image</w:t>
+            </w:r>
+          </w:p>
+        </w:tc>
+        <w:tc>
+          <w:tcPr>
+            <w:tcW w:type="dxa" w:w="1728"/>
+          </w:tcPr>
+          <w:p>
+            <w:r>
+              <w:rPr>
+                <w:b/>
+              </w:rPr>
+              <w:t>Condition</w:t>
+            </w:r>
+          </w:p>
+        </w:tc>
+        <w:tc>
+          <w:tcPr>
+            <w:tcW w:type="dxa" w:w="1728"/>
+          </w:tcPr>
+          <w:p>
+            <w:r>
+              <w:rPr>
+                <w:b/>
+              </w:rPr>
+              <w:t>Detected Occupied</w:t>
+            </w:r>
+          </w:p>
+        </w:tc>
+        <w:tc>
+          <w:tcPr>
+            <w:tcW w:type="dxa" w:w="1728"/>
+          </w:tcPr>
+          <w:p>
+            <w:r>
+              <w:rPr>
+                <w:b/>
+              </w:rPr>
+              <w:t>Detected Empty</w:t>
+            </w:r>
+          </w:p>
+        </w:tc>
+        <w:tc>
+          <w:tcPr>
+            <w:tcW w:type="dxa" w:w="1728"/>
+          </w:tcPr>
+          <w:p>
+            <w:r>
+              <w:rPr>
+                <w:b/>
+              </w:rPr>
+              <w:t>Total Spaces</w:t>
+            </w:r>
+          </w:p>
+        </w:tc>
+      </w:tr>
+      <w:tr>
+        <w:tc>
+          <w:tcPr>
+            <w:tcW w:type="dxa" w:w="1728"/>
+          </w:tcPr>
+          <w:p>
+            <w:r>
+              <w:t>UFPR1.jpg</w:t>
+            </w:r>
+          </w:p>
+        </w:tc>
+        <w:tc>
+          <w:tcPr>
+            <w:tcW w:type="dxa" w:w="1728"/>
+          </w:tcPr>
+          <w:p>
+            <w:r>
+              <w:t>Empty reference</w:t>
+            </w:r>
+          </w:p>
+        </w:tc>
+        <w:tc>
+          <w:tcPr>
+            <w:tcW w:type="dxa" w:w="1728"/>
+          </w:tcPr>
+          <w:p>
+            <w:r>
+              <w:t>0</w:t>
+            </w:r>
+          </w:p>
+        </w:tc>
+        <w:tc>
+          <w:tcPr>
+            <w:tcW w:type="dxa" w:w="1728"/>
+          </w:tcPr>
+          <w:p>
+            <w:r>
+              <w:t>257</w:t>
+            </w:r>
+          </w:p>
+        </w:tc>
+        <w:tc>
+          <w:tcPr>
+            <w:tcW w:type="dxa" w:w="1728"/>
+          </w:tcPr>
+          <w:p>
+            <w:r>
+              <w:t>257</w:t>
+            </w:r>
+          </w:p>
+        </w:tc>
+      </w:tr>
+      <w:tr>
+        <w:tc>
+          <w:tcPr>
+            <w:tcW w:type="dxa" w:w="1728"/>
+          </w:tcPr>
+          <w:p>
+            <w:r>
+              <w:t>UFPR2.jpg</w:t>
+            </w:r>
+          </w:p>
+        </w:tc>
+        <w:tc>
+          <w:tcPr>
+            <w:tcW w:type="dxa" w:w="1728"/>
+          </w:tcPr>
+          <w:p>
+            <w:r>
+              <w:t>Partially occupied</w:t>
+            </w:r>
+          </w:p>
+        </w:tc>
+        <w:tc>
+          <w:tcPr>
+            <w:tcW w:type="dxa" w:w="1728"/>
+          </w:tcPr>
+          <w:p>
+            <w:r>
+              <w:t>120</w:t>
+            </w:r>
+          </w:p>
+        </w:tc>
+        <w:tc>
+          <w:tcPr>
+            <w:tcW w:type="dxa" w:w="1728"/>
+          </w:tcPr>
+          <w:p>
+            <w:r>
+              <w:t>137</w:t>
+            </w:r>
+          </w:p>
+        </w:tc>
+        <w:tc>
+          <w:tcPr>
+            <w:tcW w:type="dxa" w:w="1728"/>
+          </w:tcPr>
+          <w:p>
+            <w:r>
+              <w:t>257</w:t>
+            </w:r>
+          </w:p>
+        </w:tc>
+      </w:tr>
+      <w:tr>
+        <w:tc>
+          <w:tcPr>
+            <w:tcW w:type="dxa" w:w="1728"/>
+          </w:tcPr>
+          <w:p>
+            <w:r>
+              <w:t>UFPR3.jpg</w:t>
+            </w:r>
+          </w:p>
+        </w:tc>
+        <w:tc>
+          <w:tcPr>
+            <w:tcW w:type="dxa" w:w="1728"/>
+          </w:tcPr>
+          <w:p>
+            <w:r>
+              <w:t>Heavily occupied</w:t>
+            </w:r>
+          </w:p>
+        </w:tc>
+        <w:tc>
+          <w:tcPr>
+            <w:tcW w:type="dxa" w:w="1728"/>
+          </w:tcPr>
+          <w:p>
+            <w:r>
+              <w:t>212</w:t>
+            </w:r>
+          </w:p>
+        </w:tc>
+        <w:tc>
+          <w:tcPr>
+            <w:tcW w:type="dxa" w:w="1728"/>
+          </w:tcPr>
+          <w:p>
+            <w:r>
+              <w:t>45</w:t>
+            </w:r>
+          </w:p>
+        </w:tc>
+        <w:tc>
+          <w:tcPr>
+            <w:tcW w:type="dxa" w:w="1728"/>
+          </w:tcPr>
+          <w:p>
+            <w:r>
+              <w:t>257</w:t>
+            </w:r>
+          </w:p>
+        </w:tc>
+      </w:tr>
+    </w:tbl>
+    <w:p/>
+    <w:p>
+      <w:r>
+        <w:t>UFPR1 achieves zero false positives on the calibration image. UFPR2 is highly accurate. UFPR3 contains low-contrast vehicles that produce insufficient edge and variance signal to cross the threshold — a known limitation of the approach described in Section 6. Annotated output images are included in the output/ directory.</w:t>
       </w:r>
     </w:p>
     <w:p>
@@ -978,14 +1243,6 @@
           <w:color w:val="1F3864"/>
         </w:rPr>
         <w:t>8. Future Work</w:t>
-      </w:r>
-    </w:p>
-    <w:p>
-      <w:pPr>
-        <w:pStyle w:val="ListBullet"/>
-      </w:pPr>
-      <w:r>
-        <w:t>Complete ROI tracing and threshold calibration for the UFPR04 and third parking lot to achieve full multi-lot coverage and a more comprehensive results table.</w:t>
       </w:r>
     </w:p>
     <w:p>

</xml_diff>

<commit_message>
add ANGlot calibrated and updated the doc and readme
</commit_message>
<xml_diff>
--- a/docs/writeup.docx
+++ b/docs/writeup.docx
@@ -574,6 +574,58 @@
           </w:p>
         </w:tc>
       </w:tr>
+      <w:tr>
+        <w:tc>
+          <w:tcPr>
+            <w:tcW w:type="dxa" w:w="1728"/>
+          </w:tcPr>
+          <w:p>
+            <w:r>
+              <w:t>ANG</w:t>
+            </w:r>
+          </w:p>
+        </w:tc>
+        <w:tc>
+          <w:tcPr>
+            <w:tcW w:type="dxa" w:w="1728"/>
+          </w:tcPr>
+          <w:p>
+            <w:r>
+              <w:t>170</w:t>
+            </w:r>
+          </w:p>
+        </w:tc>
+        <w:tc>
+          <w:tcPr>
+            <w:tcW w:type="dxa" w:w="1728"/>
+          </w:tcPr>
+          <w:p>
+            <w:r>
+              <w:t>35.0</w:t>
+            </w:r>
+          </w:p>
+        </w:tc>
+        <w:tc>
+          <w:tcPr>
+            <w:tcW w:type="dxa" w:w="1728"/>
+          </w:tcPr>
+          <w:p>
+            <w:r>
+              <w:t>166</w:t>
+            </w:r>
+          </w:p>
+        </w:tc>
+        <w:tc>
+          <w:tcPr>
+            <w:tcW w:type="dxa" w:w="1728"/>
+          </w:tcPr>
+          <w:p>
+            <w:r>
+              <w:t>30.1</w:t>
+            </w:r>
+          </w:p>
+        </w:tc>
+      </w:tr>
     </w:tbl>
     <w:p/>
     <w:p>
@@ -589,7 +641,7 @@
     </w:p>
     <w:p>
       <w:r>
-        <w:t>Each parking space ROI is defined as a quadrilateral polygon (four corner points) traced interactively using a custom OpenCV mouse-callback tool. Clicking four corners per space produces polygon coordinates that are pasted directly into the source code. The polygon mask ensures edge detection and variance are computed only within the actual space boundary, not the surrounding pavement or line markings. 43 spaces are defined for the PUCPR lot and 257 spaces for the UFPR04 lot.</w:t>
+        <w:t>Each parking space ROI is defined as a quadrilateral polygon (four corner points) traced interactively using a custom OpenCV mouse-callback tool. Clicking four corners per space produces polygon coordinates that are pasted directly into the source code. The polygon mask ensures edge detection and variance are computed only within the actual space boundary, not the surrounding pavement or line markings. 43 spaces are defined for the PUCPR lot, 257 for the UFPR04 lot, and 34 for the ANG lot.</w:t>
       </w:r>
     </w:p>
     <w:p>
@@ -605,7 +657,7 @@
     </w:p>
     <w:p>
       <w:r>
-        <w:t>Results are reported for three images per lot. Thresholds were calibrated on PUCPR3.jpg (PUCPR) and UFPR1.jpg (UFPR04), both mostly-empty reference images.</w:t>
+        <w:t>Results are reported for three images per lot. Thresholds were calibrated on PUCPR3.jpg (PUCPR), UFPR1.jpg (UFPR04), and ANG1.jpg (ANG), all mostly-empty reference images.</w:t>
       </w:r>
     </w:p>
     <w:p>
@@ -1118,6 +1170,260 @@
     </w:p>
     <w:p>
       <w:pPr>
+        <w:pStyle w:val="Heading2"/>
+      </w:pPr>
+      <w:r>
+        <w:rPr>
+          <w:color w:val="1F3864"/>
+        </w:rPr>
+        <w:t>ANG Lot</w:t>
+      </w:r>
+    </w:p>
+    <w:tbl>
+      <w:tblPr>
+        <w:tblStyle w:val="TableGrid"/>
+        <w:tblW w:type="auto" w:w="0"/>
+        <w:tblLook w:firstColumn="1" w:firstRow="1" w:lastColumn="0" w:lastRow="0" w:noHBand="0" w:noVBand="1" w:val="04A0"/>
+      </w:tblPr>
+      <w:tblGrid>
+        <w:gridCol w:w="1728"/>
+        <w:gridCol w:w="1728"/>
+        <w:gridCol w:w="1728"/>
+        <w:gridCol w:w="1728"/>
+        <w:gridCol w:w="1728"/>
+      </w:tblGrid>
+      <w:tr>
+        <w:tc>
+          <w:tcPr>
+            <w:tcW w:type="dxa" w:w="1728"/>
+          </w:tcPr>
+          <w:p>
+            <w:r>
+              <w:rPr>
+                <w:b/>
+              </w:rPr>
+              <w:t>Image</w:t>
+            </w:r>
+          </w:p>
+        </w:tc>
+        <w:tc>
+          <w:tcPr>
+            <w:tcW w:type="dxa" w:w="1728"/>
+          </w:tcPr>
+          <w:p>
+            <w:r>
+              <w:rPr>
+                <w:b/>
+              </w:rPr>
+              <w:t>Condition</w:t>
+            </w:r>
+          </w:p>
+        </w:tc>
+        <w:tc>
+          <w:tcPr>
+            <w:tcW w:type="dxa" w:w="1728"/>
+          </w:tcPr>
+          <w:p>
+            <w:r>
+              <w:rPr>
+                <w:b/>
+              </w:rPr>
+              <w:t>Detected Occupied</w:t>
+            </w:r>
+          </w:p>
+        </w:tc>
+        <w:tc>
+          <w:tcPr>
+            <w:tcW w:type="dxa" w:w="1728"/>
+          </w:tcPr>
+          <w:p>
+            <w:r>
+              <w:rPr>
+                <w:b/>
+              </w:rPr>
+              <w:t>Detected Empty</w:t>
+            </w:r>
+          </w:p>
+        </w:tc>
+        <w:tc>
+          <w:tcPr>
+            <w:tcW w:type="dxa" w:w="1728"/>
+          </w:tcPr>
+          <w:p>
+            <w:r>
+              <w:rPr>
+                <w:b/>
+              </w:rPr>
+              <w:t>Total Spaces</w:t>
+            </w:r>
+          </w:p>
+        </w:tc>
+      </w:tr>
+      <w:tr>
+        <w:tc>
+          <w:tcPr>
+            <w:tcW w:type="dxa" w:w="1728"/>
+          </w:tcPr>
+          <w:p>
+            <w:r>
+              <w:t>ANG1.jpg</w:t>
+            </w:r>
+          </w:p>
+        </w:tc>
+        <w:tc>
+          <w:tcPr>
+            <w:tcW w:type="dxa" w:w="1728"/>
+          </w:tcPr>
+          <w:p>
+            <w:r>
+              <w:t>Empty reference</w:t>
+            </w:r>
+          </w:p>
+        </w:tc>
+        <w:tc>
+          <w:tcPr>
+            <w:tcW w:type="dxa" w:w="1728"/>
+          </w:tcPr>
+          <w:p>
+            <w:r>
+              <w:t>0</w:t>
+            </w:r>
+          </w:p>
+        </w:tc>
+        <w:tc>
+          <w:tcPr>
+            <w:tcW w:type="dxa" w:w="1728"/>
+          </w:tcPr>
+          <w:p>
+            <w:r>
+              <w:t>34</w:t>
+            </w:r>
+          </w:p>
+        </w:tc>
+        <w:tc>
+          <w:tcPr>
+            <w:tcW w:type="dxa" w:w="1728"/>
+          </w:tcPr>
+          <w:p>
+            <w:r>
+              <w:t>34</w:t>
+            </w:r>
+          </w:p>
+        </w:tc>
+      </w:tr>
+      <w:tr>
+        <w:tc>
+          <w:tcPr>
+            <w:tcW w:type="dxa" w:w="1728"/>
+          </w:tcPr>
+          <w:p>
+            <w:r>
+              <w:t>ANG2.jpg</w:t>
+            </w:r>
+          </w:p>
+        </w:tc>
+        <w:tc>
+          <w:tcPr>
+            <w:tcW w:type="dxa" w:w="1728"/>
+          </w:tcPr>
+          <w:p>
+            <w:r>
+              <w:t>Partially occupied</w:t>
+            </w:r>
+          </w:p>
+        </w:tc>
+        <w:tc>
+          <w:tcPr>
+            <w:tcW w:type="dxa" w:w="1728"/>
+          </w:tcPr>
+          <w:p>
+            <w:r>
+              <w:t>8</w:t>
+            </w:r>
+          </w:p>
+        </w:tc>
+        <w:tc>
+          <w:tcPr>
+            <w:tcW w:type="dxa" w:w="1728"/>
+          </w:tcPr>
+          <w:p>
+            <w:r>
+              <w:t>26</w:t>
+            </w:r>
+          </w:p>
+        </w:tc>
+        <w:tc>
+          <w:tcPr>
+            <w:tcW w:type="dxa" w:w="1728"/>
+          </w:tcPr>
+          <w:p>
+            <w:r>
+              <w:t>34</w:t>
+            </w:r>
+          </w:p>
+        </w:tc>
+      </w:tr>
+      <w:tr>
+        <w:tc>
+          <w:tcPr>
+            <w:tcW w:type="dxa" w:w="1728"/>
+          </w:tcPr>
+          <w:p>
+            <w:r>
+              <w:t>ANG3.jpg</w:t>
+            </w:r>
+          </w:p>
+        </w:tc>
+        <w:tc>
+          <w:tcPr>
+            <w:tcW w:type="dxa" w:w="1728"/>
+          </w:tcPr>
+          <w:p>
+            <w:r>
+              <w:t>Heavily occupied</w:t>
+            </w:r>
+          </w:p>
+        </w:tc>
+        <w:tc>
+          <w:tcPr>
+            <w:tcW w:type="dxa" w:w="1728"/>
+          </w:tcPr>
+          <w:p>
+            <w:r>
+              <w:t>29</w:t>
+            </w:r>
+          </w:p>
+        </w:tc>
+        <w:tc>
+          <w:tcPr>
+            <w:tcW w:type="dxa" w:w="1728"/>
+          </w:tcPr>
+          <w:p>
+            <w:r>
+              <w:t>5</w:t>
+            </w:r>
+          </w:p>
+        </w:tc>
+        <w:tc>
+          <w:tcPr>
+            <w:tcW w:type="dxa" w:w="1728"/>
+          </w:tcPr>
+          <w:p>
+            <w:r>
+              <w:t>34</w:t>
+            </w:r>
+          </w:p>
+        </w:tc>
+      </w:tr>
+    </w:tbl>
+    <w:p/>
+    <w:p>
+      <w:r>
+        <w:t>ANG1 achieves zero false positives on the calibration image. ANG2 is highly accurate. ANG3 retains a small number of misses due to the same low-contrast vehicle overlap described in Section 6.</w:t>
+      </w:r>
+    </w:p>
+    <w:p>
+      <w:pPr>
         <w:pStyle w:val="Heading1"/>
       </w:pPr>
       <w:r>

</xml_diff>

<commit_message>
the doc version of writeup
</commit_message>
<xml_diff>
--- a/docs/writeup.docx
+++ b/docs/writeup.docx
@@ -5,6 +5,9 @@
     <w:p>
       <w:pPr>
         <w:pStyle w:val="Title"/>
+        <w:pBdr>
+          <w:bottom w:val="none" w:sz="0" w:space="0" w:color="auto"/>
+        </w:pBdr>
         <w:jc w:val="center"/>
         <w:rPr>
           <w:color w:val="000000" w:themeColor="text1"/>
@@ -84,7 +87,103 @@
         <w:rPr>
           <w:color w:val="000000" w:themeColor="text1"/>
         </w:rPr>
-        <w:t>This project implements a parking lot occupancy detector using classical computer vision techniques. The system analyzes static overhead images of parking lots and classifies each designated parking space as either OCCUPIED or EMPTY. The goal is to demonstrate practical application of image processing — specifically Canny edge detection and intensity variance analysis — without the use of machine learning.</w:t>
+        <w:t xml:space="preserve">This project </w:t>
+      </w:r>
+      <w:r>
+        <w:rPr>
+          <w:color w:val="000000" w:themeColor="text1"/>
+        </w:rPr>
+        <w:t>involves</w:t>
+      </w:r>
+      <w:r>
+        <w:rPr>
+          <w:color w:val="000000" w:themeColor="text1"/>
+        </w:rPr>
+        <w:t xml:space="preserve"> a parking lot occupancy detector using computer vision techniques. The system</w:t>
+      </w:r>
+      <w:r>
+        <w:rPr>
+          <w:color w:val="000000" w:themeColor="text1"/>
+        </w:rPr>
+        <w:t xml:space="preserve"> analyzes</w:t>
+      </w:r>
+      <w:r>
+        <w:rPr>
+          <w:color w:val="000000" w:themeColor="text1"/>
+        </w:rPr>
+        <w:t xml:space="preserve"> static </w:t>
+      </w:r>
+      <w:r>
+        <w:rPr>
+          <w:color w:val="000000" w:themeColor="text1"/>
+        </w:rPr>
+        <w:t xml:space="preserve">security camera </w:t>
+      </w:r>
+      <w:r>
+        <w:rPr>
+          <w:color w:val="000000" w:themeColor="text1"/>
+        </w:rPr>
+        <w:t xml:space="preserve">images of parking lots and </w:t>
+      </w:r>
+      <w:r>
+        <w:rPr>
+          <w:color w:val="000000" w:themeColor="text1"/>
+        </w:rPr>
+        <w:t xml:space="preserve">determines whether </w:t>
+      </w:r>
+      <w:r>
+        <w:rPr>
+          <w:color w:val="000000" w:themeColor="text1"/>
+        </w:rPr>
+        <w:t xml:space="preserve">each parking space </w:t>
+      </w:r>
+      <w:r>
+        <w:rPr>
+          <w:color w:val="000000" w:themeColor="text1"/>
+        </w:rPr>
+        <w:t>is</w:t>
+      </w:r>
+      <w:r>
+        <w:rPr>
+          <w:color w:val="000000" w:themeColor="text1"/>
+        </w:rPr>
+        <w:t xml:space="preserve"> either OCCUPIED or EMPTY. The goal is to demonstrate </w:t>
+      </w:r>
+      <w:r>
+        <w:rPr>
+          <w:color w:val="000000" w:themeColor="text1"/>
+        </w:rPr>
+        <w:t xml:space="preserve">the </w:t>
+      </w:r>
+      <w:r>
+        <w:rPr>
+          <w:color w:val="000000" w:themeColor="text1"/>
+        </w:rPr>
+        <w:t>practical application of image processing without machine learning.</w:t>
+      </w:r>
+      <w:r>
+        <w:rPr>
+          <w:color w:val="000000" w:themeColor="text1"/>
+        </w:rPr>
+        <w:t xml:space="preserve"> Originally, parking space was to be automatically detected, but it could not be implemented as described in</w:t>
+      </w:r>
+      <w:r>
+        <w:rPr>
+          <w:color w:val="000000" w:themeColor="text1"/>
+        </w:rPr>
+        <w:t xml:space="preserve"> section 5 (</w:t>
+      </w:r>
+      <w:r>
+        <w:rPr>
+          <w:color w:val="000000" w:themeColor="text1"/>
+        </w:rPr>
+        <w:t>Automatic ROI detection with Hough lines</w:t>
+      </w:r>
+      <w:r>
+        <w:rPr>
+          <w:color w:val="000000" w:themeColor="text1"/>
+        </w:rPr>
+        <w:t>).</w:t>
       </w:r>
     </w:p>
     <w:p>
@@ -111,7 +210,13 @@
         <w:rPr>
           <w:color w:val="000000" w:themeColor="text1"/>
         </w:rPr>
-        <w:t>2. Related Work / Background</w:t>
+        <w:t>2</w:t>
+      </w:r>
+      <w:r>
+        <w:rPr>
+          <w:color w:val="000000" w:themeColor="text1"/>
+        </w:rPr>
+        <w:t>. Methodology</w:t>
       </w:r>
     </w:p>
     <w:p>
@@ -124,20 +229,1074 @@
         <w:rPr>
           <w:color w:val="000000" w:themeColor="text1"/>
         </w:rPr>
-        <w:t>Parking occupancy detection has been explored through a range of approaches. Background subtraction methods (Fabian, 2011) compare live frames against a registered empty-lot reference and flag changed regions as occupied. While effective, they require a pre-captured reference image aligned to the same viewpoint. Histogram-based methods compare color distributions per space against an empty baseline. More recently, deep learning approaches (Amato et al., 2017) achieve high accuracy using CNNs but require labeled training data.</w:t>
+        <w:t xml:space="preserve">The detection pipeline </w:t>
+      </w:r>
+      <w:r>
+        <w:rPr>
+          <w:color w:val="000000" w:themeColor="text1"/>
+        </w:rPr>
+        <w:t>is</w:t>
+      </w:r>
+      <w:r>
+        <w:rPr>
+          <w:color w:val="000000" w:themeColor="text1"/>
+        </w:rPr>
+        <w:t xml:space="preserve"> the </w:t>
+      </w:r>
+      <w:r>
+        <w:rPr>
+          <w:color w:val="000000" w:themeColor="text1"/>
+        </w:rPr>
+        <w:t>following</w:t>
+      </w:r>
+      <w:r>
+        <w:rPr>
+          <w:color w:val="000000" w:themeColor="text1"/>
+        </w:rPr>
+        <w:t xml:space="preserve"> steps</w:t>
+      </w:r>
+      <w:r>
+        <w:rPr>
+          <w:color w:val="000000" w:themeColor="text1"/>
+        </w:rPr>
+        <w:t>:</w:t>
       </w:r>
     </w:p>
     <w:p>
       <w:pPr>
+        <w:pStyle w:val="ListNumber"/>
         <w:rPr>
           <w:color w:val="000000" w:themeColor="text1"/>
         </w:rPr>
       </w:pPr>
       <w:r>
         <w:rPr>
-          <w:color w:val="000000" w:themeColor="text1"/>
-        </w:rPr>
-        <w:t>This project targets a reference-free classical approach: classify each space independently using edge density and intensity variance, with thresholds calibrated on a single empty-lot image per parking lot. This makes the system self-contained and explainable, which is appropriate for the course context.</w:t>
+          <w:b/>
+          <w:color w:val="000000" w:themeColor="text1"/>
+        </w:rPr>
+        <w:t xml:space="preserve">Input: </w:t>
+      </w:r>
+      <w:r>
+        <w:rPr>
+          <w:color w:val="000000" w:themeColor="text1"/>
+        </w:rPr>
+        <w:t>640×640 pixel overhead JPEG from a fixed security camera.</w:t>
+      </w:r>
+    </w:p>
+    <w:p>
+      <w:pPr>
+        <w:pStyle w:val="ListNumber"/>
+        <w:rPr>
+          <w:color w:val="000000" w:themeColor="text1"/>
+        </w:rPr>
+      </w:pPr>
+      <w:r>
+        <w:rPr>
+          <w:b/>
+          <w:color w:val="000000" w:themeColor="text1"/>
+        </w:rPr>
+        <w:t xml:space="preserve">Grayscale: </w:t>
+      </w:r>
+      <w:proofErr w:type="gramStart"/>
+      <w:r>
+        <w:rPr>
+          <w:color w:val="000000" w:themeColor="text1"/>
+        </w:rPr>
+        <w:t>cv::</w:t>
+      </w:r>
+      <w:proofErr w:type="spellStart"/>
+      <w:proofErr w:type="gramEnd"/>
+      <w:r>
+        <w:rPr>
+          <w:color w:val="000000" w:themeColor="text1"/>
+        </w:rPr>
+        <w:t>cvtColor</w:t>
+      </w:r>
+      <w:proofErr w:type="spellEnd"/>
+      <w:r>
+        <w:rPr>
+          <w:color w:val="000000" w:themeColor="text1"/>
+        </w:rPr>
+        <w:t xml:space="preserve"> (</w:t>
+      </w:r>
+      <w:r>
+        <w:rPr>
+          <w:color w:val="000000" w:themeColor="text1"/>
+        </w:rPr>
+        <w:t xml:space="preserve">RGB to </w:t>
+      </w:r>
+      <w:r>
+        <w:rPr>
+          <w:color w:val="000000" w:themeColor="text1"/>
+        </w:rPr>
+        <w:t>GRAY)</w:t>
+      </w:r>
+      <w:r>
+        <w:rPr>
+          <w:color w:val="000000" w:themeColor="text1"/>
+        </w:rPr>
+        <w:t xml:space="preserve"> to</w:t>
+      </w:r>
+      <w:r>
+        <w:rPr>
+          <w:color w:val="000000" w:themeColor="text1"/>
+        </w:rPr>
+        <w:t xml:space="preserve"> </w:t>
+      </w:r>
+      <w:r>
+        <w:rPr>
+          <w:color w:val="000000" w:themeColor="text1"/>
+        </w:rPr>
+        <w:t>reduce</w:t>
+      </w:r>
+      <w:r>
+        <w:rPr>
+          <w:color w:val="000000" w:themeColor="text1"/>
+        </w:rPr>
+        <w:t xml:space="preserve"> color complexity, focuses on luminance.</w:t>
+      </w:r>
+    </w:p>
+    <w:p>
+      <w:pPr>
+        <w:pStyle w:val="ListNumber"/>
+        <w:rPr>
+          <w:color w:val="000000" w:themeColor="text1"/>
+        </w:rPr>
+      </w:pPr>
+      <w:r>
+        <w:rPr>
+          <w:b/>
+          <w:color w:val="000000" w:themeColor="text1"/>
+        </w:rPr>
+        <w:t xml:space="preserve">Gaussian Blur: </w:t>
+      </w:r>
+      <w:proofErr w:type="gramStart"/>
+      <w:r>
+        <w:rPr>
+          <w:color w:val="000000" w:themeColor="text1"/>
+        </w:rPr>
+        <w:t>cv::</w:t>
+      </w:r>
+      <w:proofErr w:type="gramEnd"/>
+      <w:r>
+        <w:rPr>
+          <w:color w:val="000000" w:themeColor="text1"/>
+        </w:rPr>
+        <w:t xml:space="preserve">GaussianBlur (5×5 kernel, σ=1.5) </w:t>
+      </w:r>
+      <w:r>
+        <w:rPr>
+          <w:color w:val="000000" w:themeColor="text1"/>
+        </w:rPr>
+        <w:t xml:space="preserve">to </w:t>
+      </w:r>
+      <w:r>
+        <w:rPr>
+          <w:color w:val="000000" w:themeColor="text1"/>
+        </w:rPr>
+        <w:t>suppresses high-frequency noise before edge detection.</w:t>
+      </w:r>
+    </w:p>
+    <w:p>
+      <w:pPr>
+        <w:pStyle w:val="ListNumber"/>
+        <w:rPr>
+          <w:color w:val="000000" w:themeColor="text1"/>
+        </w:rPr>
+      </w:pPr>
+      <w:r>
+        <w:rPr>
+          <w:b/>
+          <w:color w:val="000000" w:themeColor="text1"/>
+        </w:rPr>
+        <w:t xml:space="preserve">ROI Extraction: </w:t>
+      </w:r>
+      <w:r>
+        <w:rPr>
+          <w:color w:val="000000" w:themeColor="text1"/>
+        </w:rPr>
+        <w:t xml:space="preserve">Each parking space is a manually traced quadrilateral polygon. </w:t>
+      </w:r>
+      <w:proofErr w:type="gramStart"/>
+      <w:r>
+        <w:rPr>
+          <w:color w:val="000000" w:themeColor="text1"/>
+        </w:rPr>
+        <w:t>cv::</w:t>
+      </w:r>
+      <w:proofErr w:type="gramEnd"/>
+      <w:r>
+        <w:rPr>
+          <w:color w:val="000000" w:themeColor="text1"/>
+        </w:rPr>
+        <w:t>boundingRect extracts the bounding box</w:t>
+      </w:r>
+      <w:r>
+        <w:rPr>
+          <w:color w:val="000000" w:themeColor="text1"/>
+        </w:rPr>
+        <w:t>,</w:t>
+      </w:r>
+      <w:r>
+        <w:rPr>
+          <w:color w:val="000000" w:themeColor="text1"/>
+        </w:rPr>
+        <w:t xml:space="preserve"> </w:t>
+      </w:r>
+      <w:proofErr w:type="gramStart"/>
+      <w:r>
+        <w:rPr>
+          <w:color w:val="000000" w:themeColor="text1"/>
+        </w:rPr>
+        <w:t>cv::</w:t>
+      </w:r>
+      <w:proofErr w:type="spellStart"/>
+      <w:proofErr w:type="gramEnd"/>
+      <w:r>
+        <w:rPr>
+          <w:color w:val="000000" w:themeColor="text1"/>
+        </w:rPr>
+        <w:t>fillConvexPoly</w:t>
+      </w:r>
+      <w:proofErr w:type="spellEnd"/>
+      <w:r>
+        <w:rPr>
+          <w:color w:val="000000" w:themeColor="text1"/>
+        </w:rPr>
+        <w:t xml:space="preserve"> builds a pixel mask for the exact polygon shape.</w:t>
+      </w:r>
+    </w:p>
+    <w:p>
+      <w:pPr>
+        <w:pStyle w:val="ListNumber"/>
+        <w:rPr>
+          <w:color w:val="000000" w:themeColor="text1"/>
+        </w:rPr>
+      </w:pPr>
+      <w:r>
+        <w:rPr>
+          <w:b/>
+          <w:color w:val="000000" w:themeColor="text1"/>
+        </w:rPr>
+        <w:t xml:space="preserve">Signal 1 </w:t>
+      </w:r>
+      <w:r>
+        <w:rPr>
+          <w:b/>
+          <w:color w:val="000000" w:themeColor="text1"/>
+        </w:rPr>
+        <w:t>-</w:t>
+      </w:r>
+      <w:r>
+        <w:rPr>
+          <w:b/>
+          <w:color w:val="000000" w:themeColor="text1"/>
+        </w:rPr>
+        <w:t xml:space="preserve"> Edges: </w:t>
+      </w:r>
+      <w:proofErr w:type="gramStart"/>
+      <w:r>
+        <w:rPr>
+          <w:color w:val="000000" w:themeColor="text1"/>
+        </w:rPr>
+        <w:t>cv::</w:t>
+      </w:r>
+      <w:proofErr w:type="gramEnd"/>
+      <w:r>
+        <w:rPr>
+          <w:color w:val="000000" w:themeColor="text1"/>
+        </w:rPr>
+        <w:t>Canny (low=50, high=150) applied with the masked ROI.</w:t>
+      </w:r>
+      <w:r>
+        <w:rPr>
+          <w:color w:val="000000" w:themeColor="text1"/>
+        </w:rPr>
+        <w:t xml:space="preserve"> </w:t>
+      </w:r>
+      <w:proofErr w:type="gramStart"/>
+      <w:r>
+        <w:rPr>
+          <w:color w:val="000000" w:themeColor="text1"/>
+        </w:rPr>
+        <w:t>cv::</w:t>
+      </w:r>
+      <w:proofErr w:type="spellStart"/>
+      <w:proofErr w:type="gramEnd"/>
+      <w:r>
+        <w:rPr>
+          <w:color w:val="000000" w:themeColor="text1"/>
+        </w:rPr>
+        <w:t>countNonZero</w:t>
+      </w:r>
+      <w:proofErr w:type="spellEnd"/>
+      <w:r>
+        <w:rPr>
+          <w:color w:val="000000" w:themeColor="text1"/>
+        </w:rPr>
+        <w:t xml:space="preserve"> sums the edge pixel count.</w:t>
+      </w:r>
+    </w:p>
+    <w:p>
+      <w:pPr>
+        <w:pStyle w:val="ListNumber"/>
+        <w:rPr>
+          <w:color w:val="000000" w:themeColor="text1"/>
+        </w:rPr>
+      </w:pPr>
+      <w:r>
+        <w:rPr>
+          <w:b/>
+          <w:color w:val="000000" w:themeColor="text1"/>
+        </w:rPr>
+        <w:t xml:space="preserve">Signal 2 </w:t>
+      </w:r>
+      <w:r>
+        <w:rPr>
+          <w:b/>
+          <w:color w:val="000000" w:themeColor="text1"/>
+        </w:rPr>
+        <w:t>-</w:t>
+      </w:r>
+      <w:r>
+        <w:rPr>
+          <w:b/>
+          <w:color w:val="000000" w:themeColor="text1"/>
+        </w:rPr>
+        <w:t xml:space="preserve"> Variance: </w:t>
+      </w:r>
+      <w:proofErr w:type="gramStart"/>
+      <w:r>
+        <w:rPr>
+          <w:color w:val="000000" w:themeColor="text1"/>
+        </w:rPr>
+        <w:t>cv::</w:t>
+      </w:r>
+      <w:proofErr w:type="spellStart"/>
+      <w:proofErr w:type="gramEnd"/>
+      <w:r>
+        <w:rPr>
+          <w:color w:val="000000" w:themeColor="text1"/>
+        </w:rPr>
+        <w:t>meanStdDev</w:t>
+      </w:r>
+      <w:proofErr w:type="spellEnd"/>
+      <w:r>
+        <w:rPr>
+          <w:color w:val="000000" w:themeColor="text1"/>
+        </w:rPr>
+        <w:t xml:space="preserve"> on the masked ROI pixels. Empty pavement is spectrally uniform (low σ)</w:t>
+      </w:r>
+      <w:r>
+        <w:rPr>
+          <w:color w:val="000000" w:themeColor="text1"/>
+        </w:rPr>
+        <w:t>, meaning</w:t>
+      </w:r>
+      <w:r>
+        <w:rPr>
+          <w:color w:val="000000" w:themeColor="text1"/>
+        </w:rPr>
+        <w:t xml:space="preserve"> vehicles introduce texture and shadow (high σ).</w:t>
+      </w:r>
+    </w:p>
+    <w:p>
+      <w:pPr>
+        <w:pStyle w:val="ListNumber"/>
+        <w:rPr>
+          <w:color w:val="000000" w:themeColor="text1"/>
+        </w:rPr>
+      </w:pPr>
+      <w:r>
+        <w:rPr>
+          <w:b/>
+          <w:color w:val="000000" w:themeColor="text1"/>
+        </w:rPr>
+        <w:t xml:space="preserve">Classification: </w:t>
+      </w:r>
+      <w:r>
+        <w:rPr>
+          <w:color w:val="000000" w:themeColor="text1"/>
+        </w:rPr>
+        <w:t>OCCUPIED if edgeCount &gt; edgeThreshold OR stddev &gt; varianceThreshold. Both thresholds are calibrated per lot on an empty reference image (threshold = observed maximum + 10 margin).</w:t>
+      </w:r>
+    </w:p>
+    <w:p>
+      <w:pPr>
+        <w:pStyle w:val="ListNumber"/>
+        <w:rPr>
+          <w:color w:val="000000" w:themeColor="text1"/>
+        </w:rPr>
+      </w:pPr>
+      <w:r>
+        <w:rPr>
+          <w:b/>
+          <w:color w:val="000000" w:themeColor="text1"/>
+        </w:rPr>
+        <w:t xml:space="preserve">Visualization: </w:t>
+      </w:r>
+      <w:r>
+        <w:rPr>
+          <w:color w:val="000000" w:themeColor="text1"/>
+        </w:rPr>
+        <w:t>cv::polylines draws red (OCCUPIED) or green (EMPTY) polygon outlines. cv::putText overlays OCC/EMP labels and a total count.</w:t>
+      </w:r>
+    </w:p>
+    <w:p>
+      <w:pPr>
+        <w:pStyle w:val="ListNumber"/>
+        <w:rPr>
+          <w:color w:val="000000" w:themeColor="text1"/>
+        </w:rPr>
+      </w:pPr>
+      <w:r>
+        <w:rPr>
+          <w:b/>
+          <w:color w:val="000000" w:themeColor="text1"/>
+        </w:rPr>
+        <w:t xml:space="preserve">Output: </w:t>
+      </w:r>
+      <w:r>
+        <w:rPr>
+          <w:color w:val="000000" w:themeColor="text1"/>
+        </w:rPr>
+        <w:t xml:space="preserve">Annotated image saved to output/ via </w:t>
+      </w:r>
+      <w:proofErr w:type="gramStart"/>
+      <w:r>
+        <w:rPr>
+          <w:color w:val="000000" w:themeColor="text1"/>
+        </w:rPr>
+        <w:t>cv::</w:t>
+      </w:r>
+      <w:proofErr w:type="spellStart"/>
+      <w:proofErr w:type="gramEnd"/>
+      <w:r>
+        <w:rPr>
+          <w:color w:val="000000" w:themeColor="text1"/>
+        </w:rPr>
+        <w:t>imwrite</w:t>
+      </w:r>
+      <w:proofErr w:type="spellEnd"/>
+      <w:r>
+        <w:rPr>
+          <w:color w:val="000000" w:themeColor="text1"/>
+        </w:rPr>
+        <w:t xml:space="preserve">; displayed via </w:t>
+      </w:r>
+      <w:proofErr w:type="gramStart"/>
+      <w:r>
+        <w:rPr>
+          <w:color w:val="000000" w:themeColor="text1"/>
+        </w:rPr>
+        <w:t>cv::</w:t>
+      </w:r>
+      <w:proofErr w:type="spellStart"/>
+      <w:proofErr w:type="gramEnd"/>
+      <w:r>
+        <w:rPr>
+          <w:color w:val="000000" w:themeColor="text1"/>
+        </w:rPr>
+        <w:t>imshow</w:t>
+      </w:r>
+      <w:proofErr w:type="spellEnd"/>
+      <w:r>
+        <w:rPr>
+          <w:color w:val="000000" w:themeColor="text1"/>
+        </w:rPr>
+        <w:t>.</w:t>
+      </w:r>
+    </w:p>
+    <w:p>
+      <w:pPr>
+        <w:pStyle w:val="ListNumber"/>
+        <w:numPr>
+          <w:ilvl w:val="0"/>
+          <w:numId w:val="0"/>
+        </w:numPr>
+        <w:rPr>
+          <w:b/>
+          <w:color w:val="000000" w:themeColor="text1"/>
+        </w:rPr>
+      </w:pPr>
+    </w:p>
+    <w:p>
+      <w:pPr>
+        <w:pStyle w:val="Heading2"/>
+        <w:rPr>
+          <w:b w:val="0"/>
+          <w:bCs w:val="0"/>
+          <w:color w:val="000000" w:themeColor="text1"/>
+        </w:rPr>
+      </w:pPr>
+      <w:r>
+        <w:rPr>
+          <w:color w:val="000000" w:themeColor="text1"/>
+        </w:rPr>
+        <w:lastRenderedPageBreak/>
+        <w:t xml:space="preserve">Gray, Blur, and Canny Images </w:t>
+      </w:r>
+      <w:r>
+        <w:rPr>
+          <w:b w:val="0"/>
+          <w:bCs w:val="0"/>
+          <w:color w:val="000000" w:themeColor="text1"/>
+          <w:sz w:val="22"/>
+          <w:szCs w:val="22"/>
+        </w:rPr>
+        <w:t>(</w:t>
+      </w:r>
+      <w:r>
+        <w:rPr>
+          <w:b w:val="0"/>
+          <w:bCs w:val="0"/>
+          <w:color w:val="000000" w:themeColor="text1"/>
+          <w:sz w:val="22"/>
+          <w:szCs w:val="22"/>
+        </w:rPr>
+        <w:t>ANG1.jpg</w:t>
+      </w:r>
+      <w:r>
+        <w:rPr>
+          <w:b w:val="0"/>
+          <w:bCs w:val="0"/>
+          <w:color w:val="000000" w:themeColor="text1"/>
+          <w:sz w:val="22"/>
+          <w:szCs w:val="22"/>
+        </w:rPr>
+        <w:t>)</w:t>
+      </w:r>
+    </w:p>
+    <w:p>
+      <w:pPr>
+        <w:pStyle w:val="ListNumber"/>
+        <w:numPr>
+          <w:ilvl w:val="0"/>
+          <w:numId w:val="0"/>
+        </w:numPr>
+        <w:spacing w:before="240"/>
+        <w:ind w:left="360"/>
+        <w:jc w:val="center"/>
+        <w:rPr>
+          <w:color w:val="000000" w:themeColor="text1"/>
+        </w:rPr>
+      </w:pPr>
+      <w:r>
+        <w:rPr>
+          <w:color w:val="000000" w:themeColor="text1"/>
+        </w:rPr>
+        <w:drawing>
+          <wp:inline distT="0" distB="0" distL="0" distR="0" wp14:anchorId="76D01AAA" wp14:editId="78D7CC75">
+            <wp:extent cx="2562210" cy="2562210"/>
+            <wp:effectExtent l="0" t="0" r="0" b="0"/>
+            <wp:docPr id="5" name="Picture 4">
+              <a:extLst xmlns:a="http://schemas.openxmlformats.org/drawingml/2006/main">
+                <a:ext uri="{FF2B5EF4-FFF2-40B4-BE49-F238E27FC236}">
+                  <a16:creationId xmlns:a16="http://schemas.microsoft.com/office/drawing/2014/main" id="{C8862D86-D644-2217-0D3D-BA92BE5DE7AC}"/>
+                </a:ext>
+              </a:extLst>
+            </wp:docPr>
+            <wp:cNvGraphicFramePr>
+              <a:graphicFrameLocks xmlns:a="http://schemas.openxmlformats.org/drawingml/2006/main" noChangeAspect="1"/>
+            </wp:cNvGraphicFramePr>
+            <a:graphic xmlns:a="http://schemas.openxmlformats.org/drawingml/2006/main">
+              <a:graphicData uri="http://schemas.openxmlformats.org/drawingml/2006/picture">
+                <pic:pic xmlns:pic="http://schemas.openxmlformats.org/drawingml/2006/picture">
+                  <pic:nvPicPr>
+                    <pic:cNvPr id="5" name="Picture 4">
+                      <a:extLst>
+                        <a:ext uri="{FF2B5EF4-FFF2-40B4-BE49-F238E27FC236}">
+                          <a16:creationId xmlns:a16="http://schemas.microsoft.com/office/drawing/2014/main" id="{C8862D86-D644-2217-0D3D-BA92BE5DE7AC}"/>
+                        </a:ext>
+                      </a:extLst>
+                    </pic:cNvPr>
+                    <pic:cNvPicPr>
+                      <a:picLocks noChangeAspect="1"/>
+                    </pic:cNvPicPr>
+                  </pic:nvPicPr>
+                  <pic:blipFill>
+                    <a:blip r:embed="rId6">
+                      <a:extLst>
+                        <a:ext uri="{28A0092B-C50C-407E-A947-70E740481C1C}">
+                          <a14:useLocalDpi xmlns:a14="http://schemas.microsoft.com/office/drawing/2010/main" val="0"/>
+                        </a:ext>
+                      </a:extLst>
+                    </a:blip>
+                    <a:stretch>
+                      <a:fillRect/>
+                    </a:stretch>
+                  </pic:blipFill>
+                  <pic:spPr>
+                    <a:xfrm>
+                      <a:off x="0" y="0"/>
+                      <a:ext cx="2628238" cy="2628238"/>
+                    </a:xfrm>
+                    <a:prstGeom prst="rect">
+                      <a:avLst/>
+                    </a:prstGeom>
+                  </pic:spPr>
+                </pic:pic>
+              </a:graphicData>
+            </a:graphic>
+          </wp:inline>
+        </w:drawing>
+      </w:r>
+      <w:r>
+        <w:rPr>
+          <w:color w:val="000000" w:themeColor="text1"/>
+        </w:rPr>
+        <w:drawing>
+          <wp:inline distT="0" distB="0" distL="0" distR="0" wp14:anchorId="5FEF9E73" wp14:editId="610573D8">
+            <wp:extent cx="2572696" cy="2572696"/>
+            <wp:effectExtent l="0" t="0" r="0" b="0"/>
+            <wp:docPr id="3" name="Picture 2">
+              <a:extLst xmlns:a="http://schemas.openxmlformats.org/drawingml/2006/main">
+                <a:ext uri="{FF2B5EF4-FFF2-40B4-BE49-F238E27FC236}">
+                  <a16:creationId xmlns:a16="http://schemas.microsoft.com/office/drawing/2014/main" id="{EE014A37-4EEA-7374-9905-A99D61026960}"/>
+                </a:ext>
+              </a:extLst>
+            </wp:docPr>
+            <wp:cNvGraphicFramePr>
+              <a:graphicFrameLocks xmlns:a="http://schemas.openxmlformats.org/drawingml/2006/main" noChangeAspect="1"/>
+            </wp:cNvGraphicFramePr>
+            <a:graphic xmlns:a="http://schemas.openxmlformats.org/drawingml/2006/main">
+              <a:graphicData uri="http://schemas.openxmlformats.org/drawingml/2006/picture">
+                <pic:pic xmlns:pic="http://schemas.openxmlformats.org/drawingml/2006/picture">
+                  <pic:nvPicPr>
+                    <pic:cNvPr id="3" name="Picture 2">
+                      <a:extLst>
+                        <a:ext uri="{FF2B5EF4-FFF2-40B4-BE49-F238E27FC236}">
+                          <a16:creationId xmlns:a16="http://schemas.microsoft.com/office/drawing/2014/main" id="{EE014A37-4EEA-7374-9905-A99D61026960}"/>
+                        </a:ext>
+                      </a:extLst>
+                    </pic:cNvPr>
+                    <pic:cNvPicPr>
+                      <a:picLocks noChangeAspect="1"/>
+                    </pic:cNvPicPr>
+                  </pic:nvPicPr>
+                  <pic:blipFill>
+                    <a:blip r:embed="rId7">
+                      <a:extLst>
+                        <a:ext uri="{28A0092B-C50C-407E-A947-70E740481C1C}">
+                          <a14:useLocalDpi xmlns:a14="http://schemas.microsoft.com/office/drawing/2010/main" val="0"/>
+                        </a:ext>
+                      </a:extLst>
+                    </a:blip>
+                    <a:stretch>
+                      <a:fillRect/>
+                    </a:stretch>
+                  </pic:blipFill>
+                  <pic:spPr>
+                    <a:xfrm>
+                      <a:off x="0" y="0"/>
+                      <a:ext cx="2596132" cy="2596132"/>
+                    </a:xfrm>
+                    <a:prstGeom prst="rect">
+                      <a:avLst/>
+                    </a:prstGeom>
+                  </pic:spPr>
+                </pic:pic>
+              </a:graphicData>
+            </a:graphic>
+          </wp:inline>
+        </w:drawing>
+      </w:r>
+      <w:r>
+        <w:rPr>
+          <w:color w:val="000000" w:themeColor="text1"/>
+        </w:rPr>
+        <w:drawing>
+          <wp:inline distT="0" distB="0" distL="0" distR="0" wp14:anchorId="216F85AA" wp14:editId="54385019">
+            <wp:extent cx="2561590" cy="2561590"/>
+            <wp:effectExtent l="0" t="0" r="0" b="0"/>
+            <wp:docPr id="7" name="Picture 6">
+              <a:extLst xmlns:a="http://schemas.openxmlformats.org/drawingml/2006/main">
+                <a:ext uri="{FF2B5EF4-FFF2-40B4-BE49-F238E27FC236}">
+                  <a16:creationId xmlns:a16="http://schemas.microsoft.com/office/drawing/2014/main" id="{68BA546B-5E26-24B2-B274-949D3C4A052B}"/>
+                </a:ext>
+              </a:extLst>
+            </wp:docPr>
+            <wp:cNvGraphicFramePr>
+              <a:graphicFrameLocks xmlns:a="http://schemas.openxmlformats.org/drawingml/2006/main" noChangeAspect="1"/>
+            </wp:cNvGraphicFramePr>
+            <a:graphic xmlns:a="http://schemas.openxmlformats.org/drawingml/2006/main">
+              <a:graphicData uri="http://schemas.openxmlformats.org/drawingml/2006/picture">
+                <pic:pic xmlns:pic="http://schemas.openxmlformats.org/drawingml/2006/picture">
+                  <pic:nvPicPr>
+                    <pic:cNvPr id="7" name="Picture 6">
+                      <a:extLst>
+                        <a:ext uri="{FF2B5EF4-FFF2-40B4-BE49-F238E27FC236}">
+                          <a16:creationId xmlns:a16="http://schemas.microsoft.com/office/drawing/2014/main" id="{68BA546B-5E26-24B2-B274-949D3C4A052B}"/>
+                        </a:ext>
+                      </a:extLst>
+                    </pic:cNvPr>
+                    <pic:cNvPicPr>
+                      <a:picLocks noChangeAspect="1"/>
+                    </pic:cNvPicPr>
+                  </pic:nvPicPr>
+                  <pic:blipFill>
+                    <a:blip r:embed="rId8">
+                      <a:extLst>
+                        <a:ext uri="{28A0092B-C50C-407E-A947-70E740481C1C}">
+                          <a14:useLocalDpi xmlns:a14="http://schemas.microsoft.com/office/drawing/2010/main" val="0"/>
+                        </a:ext>
+                      </a:extLst>
+                    </a:blip>
+                    <a:stretch>
+                      <a:fillRect/>
+                    </a:stretch>
+                  </pic:blipFill>
+                  <pic:spPr>
+                    <a:xfrm>
+                      <a:off x="0" y="0"/>
+                      <a:ext cx="2577654" cy="2577654"/>
+                    </a:xfrm>
+                    <a:prstGeom prst="rect">
+                      <a:avLst/>
+                    </a:prstGeom>
+                  </pic:spPr>
+                </pic:pic>
+              </a:graphicData>
+            </a:graphic>
+          </wp:inline>
+        </w:drawing>
+      </w:r>
+    </w:p>
+    <w:p>
+      <w:pPr>
+        <w:pStyle w:val="Heading2"/>
+        <w:spacing w:before="0"/>
+        <w:rPr>
+          <w:color w:val="000000" w:themeColor="text1"/>
+        </w:rPr>
+      </w:pPr>
+      <w:proofErr w:type="spellStart"/>
+      <w:r>
+        <w:rPr>
+          <w:color w:val="000000" w:themeColor="text1"/>
+        </w:rPr>
+        <w:lastRenderedPageBreak/>
+        <w:t>Canny_ROI</w:t>
+      </w:r>
+      <w:proofErr w:type="spellEnd"/>
+      <w:r>
+        <w:rPr>
+          <w:color w:val="000000" w:themeColor="text1"/>
+        </w:rPr>
+        <w:t xml:space="preserve"> Images</w:t>
+      </w:r>
+      <w:r>
+        <w:rPr>
+          <w:color w:val="000000" w:themeColor="text1"/>
+        </w:rPr>
+        <w:t xml:space="preserve"> </w:t>
+      </w:r>
+      <w:r>
+        <w:rPr>
+          <w:b w:val="0"/>
+          <w:bCs w:val="0"/>
+          <w:color w:val="000000" w:themeColor="text1"/>
+          <w:sz w:val="22"/>
+          <w:szCs w:val="22"/>
+        </w:rPr>
+        <w:t>(ANG1.jpg and ANG2.jpg)</w:t>
+      </w:r>
+    </w:p>
+    <w:p>
+      <w:r>
+        <w:drawing>
+          <wp:inline distT="0" distB="0" distL="0" distR="0" wp14:anchorId="547956F9" wp14:editId="5B89994E">
+            <wp:extent cx="2711302" cy="2711302"/>
+            <wp:effectExtent l="0" t="0" r="0" b="0"/>
+            <wp:docPr id="563648080" name="Picture 2">
+              <a:extLst xmlns:a="http://schemas.openxmlformats.org/drawingml/2006/main">
+                <a:ext uri="{FF2B5EF4-FFF2-40B4-BE49-F238E27FC236}">
+                  <a16:creationId xmlns:a16="http://schemas.microsoft.com/office/drawing/2014/main" id="{45D2A1BB-7448-9E57-17FC-86CF387E2AA1}"/>
+                </a:ext>
+              </a:extLst>
+            </wp:docPr>
+            <wp:cNvGraphicFramePr>
+              <a:graphicFrameLocks xmlns:a="http://schemas.openxmlformats.org/drawingml/2006/main" noChangeAspect="1"/>
+            </wp:cNvGraphicFramePr>
+            <a:graphic xmlns:a="http://schemas.openxmlformats.org/drawingml/2006/main">
+              <a:graphicData uri="http://schemas.openxmlformats.org/drawingml/2006/picture">
+                <pic:pic xmlns:pic="http://schemas.openxmlformats.org/drawingml/2006/picture">
+                  <pic:nvPicPr>
+                    <pic:cNvPr id="3" name="Picture 2">
+                      <a:extLst>
+                        <a:ext uri="{FF2B5EF4-FFF2-40B4-BE49-F238E27FC236}">
+                          <a16:creationId xmlns:a16="http://schemas.microsoft.com/office/drawing/2014/main" id="{45D2A1BB-7448-9E57-17FC-86CF387E2AA1}"/>
+                        </a:ext>
+                      </a:extLst>
+                    </pic:cNvPr>
+                    <pic:cNvPicPr>
+                      <a:picLocks noChangeAspect="1"/>
+                    </pic:cNvPicPr>
+                  </pic:nvPicPr>
+                  <pic:blipFill>
+                    <a:blip r:embed="rId9">
+                      <a:extLst>
+                        <a:ext uri="{28A0092B-C50C-407E-A947-70E740481C1C}">
+                          <a14:useLocalDpi xmlns:a14="http://schemas.microsoft.com/office/drawing/2010/main" val="0"/>
+                        </a:ext>
+                      </a:extLst>
+                    </a:blip>
+                    <a:stretch>
+                      <a:fillRect/>
+                    </a:stretch>
+                  </pic:blipFill>
+                  <pic:spPr>
+                    <a:xfrm>
+                      <a:off x="0" y="0"/>
+                      <a:ext cx="2720573" cy="2720573"/>
+                    </a:xfrm>
+                    <a:prstGeom prst="rect">
+                      <a:avLst/>
+                    </a:prstGeom>
+                  </pic:spPr>
+                </pic:pic>
+              </a:graphicData>
+            </a:graphic>
+          </wp:inline>
+        </w:drawing>
+      </w:r>
+      <w:r>
+        <w:rPr>
+          <w:noProof/>
+        </w:rPr>
+        <w:t xml:space="preserve"> </w:t>
+      </w:r>
+      <w:r>
+        <w:drawing>
+          <wp:inline distT="0" distB="0" distL="0" distR="0" wp14:anchorId="62759CC7" wp14:editId="054E6CAD">
+            <wp:extent cx="2721935" cy="2721935"/>
+            <wp:effectExtent l="0" t="0" r="2540" b="2540"/>
+            <wp:docPr id="1456499022" name="Picture 4">
+              <a:extLst xmlns:a="http://schemas.openxmlformats.org/drawingml/2006/main">
+                <a:ext uri="{FF2B5EF4-FFF2-40B4-BE49-F238E27FC236}">
+                  <a16:creationId xmlns:a16="http://schemas.microsoft.com/office/drawing/2014/main" id="{C9FC4791-7115-D266-5277-D7C7F2FD7695}"/>
+                </a:ext>
+              </a:extLst>
+            </wp:docPr>
+            <wp:cNvGraphicFramePr>
+              <a:graphicFrameLocks xmlns:a="http://schemas.openxmlformats.org/drawingml/2006/main" noChangeAspect="1"/>
+            </wp:cNvGraphicFramePr>
+            <a:graphic xmlns:a="http://schemas.openxmlformats.org/drawingml/2006/main">
+              <a:graphicData uri="http://schemas.openxmlformats.org/drawingml/2006/picture">
+                <pic:pic xmlns:pic="http://schemas.openxmlformats.org/drawingml/2006/picture">
+                  <pic:nvPicPr>
+                    <pic:cNvPr id="5" name="Picture 4">
+                      <a:extLst>
+                        <a:ext uri="{FF2B5EF4-FFF2-40B4-BE49-F238E27FC236}">
+                          <a16:creationId xmlns:a16="http://schemas.microsoft.com/office/drawing/2014/main" id="{C9FC4791-7115-D266-5277-D7C7F2FD7695}"/>
+                        </a:ext>
+                      </a:extLst>
+                    </pic:cNvPr>
+                    <pic:cNvPicPr>
+                      <a:picLocks noChangeAspect="1"/>
+                    </pic:cNvPicPr>
+                  </pic:nvPicPr>
+                  <pic:blipFill>
+                    <a:blip r:embed="rId10">
+                      <a:extLst>
+                        <a:ext uri="{28A0092B-C50C-407E-A947-70E740481C1C}">
+                          <a14:useLocalDpi xmlns:a14="http://schemas.microsoft.com/office/drawing/2010/main" val="0"/>
+                        </a:ext>
+                      </a:extLst>
+                    </a:blip>
+                    <a:stretch>
+                      <a:fillRect/>
+                    </a:stretch>
+                  </pic:blipFill>
+                  <pic:spPr>
+                    <a:xfrm>
+                      <a:off x="0" y="0"/>
+                      <a:ext cx="2728078" cy="2728078"/>
+                    </a:xfrm>
+                    <a:prstGeom prst="rect">
+                      <a:avLst/>
+                    </a:prstGeom>
+                  </pic:spPr>
+                </pic:pic>
+              </a:graphicData>
+            </a:graphic>
+          </wp:inline>
+        </w:drawing>
+      </w:r>
+    </w:p>
+    <w:p>
+      <w:pPr>
+        <w:pStyle w:val="Heading2"/>
+        <w:rPr>
+          <w:color w:val="000000" w:themeColor="text1"/>
+        </w:rPr>
+      </w:pPr>
+      <w:r>
+        <w:rPr>
+          <w:color w:val="000000" w:themeColor="text1"/>
+        </w:rPr>
+        <w:t>Variance</w:t>
+      </w:r>
+      <w:r>
+        <w:rPr>
+          <w:color w:val="000000" w:themeColor="text1"/>
+        </w:rPr>
+        <w:t xml:space="preserve"> Images</w:t>
+      </w:r>
+      <w:r>
+        <w:rPr>
+          <w:color w:val="000000" w:themeColor="text1"/>
+        </w:rPr>
+        <w:t xml:space="preserve"> </w:t>
+      </w:r>
+      <w:r>
+        <w:rPr>
+          <w:b w:val="0"/>
+          <w:bCs w:val="0"/>
+          <w:color w:val="000000" w:themeColor="text1"/>
+          <w:sz w:val="22"/>
+          <w:szCs w:val="22"/>
+        </w:rPr>
+        <w:t>(ANG1.jpg and ANG2.jpg)</w:t>
+      </w:r>
+    </w:p>
+    <w:p>
+      <w:pPr>
+        <w:pStyle w:val="ListNumber"/>
+        <w:numPr>
+          <w:ilvl w:val="0"/>
+          <w:numId w:val="0"/>
+        </w:numPr>
+        <w:ind w:left="360" w:hanging="360"/>
+        <w:rPr>
+          <w:noProof/>
+        </w:rPr>
+      </w:pPr>
+      <w:r>
+        <w:rPr>
+          <w:color w:val="000000" w:themeColor="text1"/>
+        </w:rPr>
+        <w:drawing>
+          <wp:inline distT="0" distB="0" distL="0" distR="0" wp14:anchorId="71D9F0E6" wp14:editId="2ADE1B4F">
+            <wp:extent cx="2721802" cy="2721802"/>
+            <wp:effectExtent l="0" t="0" r="2540" b="2540"/>
+            <wp:docPr id="1468029161" name="Picture 2">
+              <a:extLst xmlns:a="http://schemas.openxmlformats.org/drawingml/2006/main">
+                <a:ext uri="{FF2B5EF4-FFF2-40B4-BE49-F238E27FC236}">
+                  <a16:creationId xmlns:a16="http://schemas.microsoft.com/office/drawing/2014/main" id="{C62DAE9E-4B47-4CC9-68B7-22DF2F63F588}"/>
+                </a:ext>
+              </a:extLst>
+            </wp:docPr>
+            <wp:cNvGraphicFramePr>
+              <a:graphicFrameLocks xmlns:a="http://schemas.openxmlformats.org/drawingml/2006/main" noChangeAspect="1"/>
+            </wp:cNvGraphicFramePr>
+            <a:graphic xmlns:a="http://schemas.openxmlformats.org/drawingml/2006/main">
+              <a:graphicData uri="http://schemas.openxmlformats.org/drawingml/2006/picture">
+                <pic:pic xmlns:pic="http://schemas.openxmlformats.org/drawingml/2006/picture">
+                  <pic:nvPicPr>
+                    <pic:cNvPr id="3" name="Picture 2">
+                      <a:extLst>
+                        <a:ext uri="{FF2B5EF4-FFF2-40B4-BE49-F238E27FC236}">
+                          <a16:creationId xmlns:a16="http://schemas.microsoft.com/office/drawing/2014/main" id="{C62DAE9E-4B47-4CC9-68B7-22DF2F63F588}"/>
+                        </a:ext>
+                      </a:extLst>
+                    </pic:cNvPr>
+                    <pic:cNvPicPr>
+                      <a:picLocks noChangeAspect="1"/>
+                    </pic:cNvPicPr>
+                  </pic:nvPicPr>
+                  <pic:blipFill>
+                    <a:blip r:embed="rId11">
+                      <a:extLst>
+                        <a:ext uri="{28A0092B-C50C-407E-A947-70E740481C1C}">
+                          <a14:useLocalDpi xmlns:a14="http://schemas.microsoft.com/office/drawing/2010/main" val="0"/>
+                        </a:ext>
+                      </a:extLst>
+                    </a:blip>
+                    <a:stretch>
+                      <a:fillRect/>
+                    </a:stretch>
+                  </pic:blipFill>
+                  <pic:spPr>
+                    <a:xfrm>
+                      <a:off x="0" y="0"/>
+                      <a:ext cx="2735205" cy="2735205"/>
+                    </a:xfrm>
+                    <a:prstGeom prst="rect">
+                      <a:avLst/>
+                    </a:prstGeom>
+                  </pic:spPr>
+                </pic:pic>
+              </a:graphicData>
+            </a:graphic>
+          </wp:inline>
+        </w:drawing>
+      </w:r>
+      <w:r>
+        <w:rPr>
+          <w:noProof/>
+        </w:rPr>
+        <w:t xml:space="preserve"> </w:t>
+      </w:r>
+      <w:r>
+        <w:rPr>
+          <w:color w:val="000000" w:themeColor="text1"/>
+        </w:rPr>
+        <w:drawing>
+          <wp:inline distT="0" distB="0" distL="0" distR="0" wp14:anchorId="08C8DFE0" wp14:editId="31A8C79F">
+            <wp:extent cx="2710771" cy="2710771"/>
+            <wp:effectExtent l="0" t="0" r="0" b="0"/>
+            <wp:docPr id="561735321" name="Picture 4">
+              <a:extLst xmlns:a="http://schemas.openxmlformats.org/drawingml/2006/main">
+                <a:ext uri="{FF2B5EF4-FFF2-40B4-BE49-F238E27FC236}">
+                  <a16:creationId xmlns:a16="http://schemas.microsoft.com/office/drawing/2014/main" id="{044205EA-CF07-50FA-536C-A851F3297454}"/>
+                </a:ext>
+              </a:extLst>
+            </wp:docPr>
+            <wp:cNvGraphicFramePr>
+              <a:graphicFrameLocks xmlns:a="http://schemas.openxmlformats.org/drawingml/2006/main" noChangeAspect="1"/>
+            </wp:cNvGraphicFramePr>
+            <a:graphic xmlns:a="http://schemas.openxmlformats.org/drawingml/2006/main">
+              <a:graphicData uri="http://schemas.openxmlformats.org/drawingml/2006/picture">
+                <pic:pic xmlns:pic="http://schemas.openxmlformats.org/drawingml/2006/picture">
+                  <pic:nvPicPr>
+                    <pic:cNvPr id="5" name="Picture 4">
+                      <a:extLst>
+                        <a:ext uri="{FF2B5EF4-FFF2-40B4-BE49-F238E27FC236}">
+                          <a16:creationId xmlns:a16="http://schemas.microsoft.com/office/drawing/2014/main" id="{044205EA-CF07-50FA-536C-A851F3297454}"/>
+                        </a:ext>
+                      </a:extLst>
+                    </pic:cNvPr>
+                    <pic:cNvPicPr>
+                      <a:picLocks noChangeAspect="1"/>
+                    </pic:cNvPicPr>
+                  </pic:nvPicPr>
+                  <pic:blipFill>
+                    <a:blip r:embed="rId12">
+                      <a:extLst>
+                        <a:ext uri="{28A0092B-C50C-407E-A947-70E740481C1C}">
+                          <a14:useLocalDpi xmlns:a14="http://schemas.microsoft.com/office/drawing/2010/main" val="0"/>
+                        </a:ext>
+                      </a:extLst>
+                    </a:blip>
+                    <a:stretch>
+                      <a:fillRect/>
+                    </a:stretch>
+                  </pic:blipFill>
+                  <pic:spPr>
+                    <a:xfrm>
+                      <a:off x="0" y="0"/>
+                      <a:ext cx="2726932" cy="2726932"/>
+                    </a:xfrm>
+                    <a:prstGeom prst="rect">
+                      <a:avLst/>
+                    </a:prstGeom>
+                  </pic:spPr>
+                </pic:pic>
+              </a:graphicData>
+            </a:graphic>
+          </wp:inline>
+        </w:drawing>
       </w:r>
     </w:p>
     <w:p>
@@ -151,224 +1310,13 @@
         <w:rPr>
           <w:color w:val="000000" w:themeColor="text1"/>
         </w:rPr>
-        <w:t>3. Methodology</w:t>
-      </w:r>
-    </w:p>
-    <w:p>
-      <w:pPr>
-        <w:rPr>
-          <w:color w:val="000000" w:themeColor="text1"/>
-        </w:rPr>
-      </w:pPr>
-      <w:r>
-        <w:rPr>
-          <w:color w:val="000000" w:themeColor="text1"/>
-        </w:rPr>
-        <w:t>The detection pipeline consists of the following sequential stages:</w:t>
-      </w:r>
-    </w:p>
-    <w:p>
-      <w:pPr>
-        <w:pStyle w:val="ListNumber"/>
-        <w:rPr>
-          <w:color w:val="000000" w:themeColor="text1"/>
-        </w:rPr>
-      </w:pPr>
-      <w:r>
-        <w:rPr>
-          <w:b/>
-          <w:color w:val="000000" w:themeColor="text1"/>
-        </w:rPr>
-        <w:t xml:space="preserve">Input: </w:t>
-      </w:r>
-      <w:r>
-        <w:rPr>
-          <w:color w:val="000000" w:themeColor="text1"/>
-        </w:rPr>
-        <w:t>640×640 pixel overhead JPEG from a fixed security camera.</w:t>
-      </w:r>
-    </w:p>
-    <w:p>
-      <w:pPr>
-        <w:pStyle w:val="ListNumber"/>
-        <w:rPr>
-          <w:color w:val="000000" w:themeColor="text1"/>
-        </w:rPr>
-      </w:pPr>
-      <w:r>
-        <w:rPr>
-          <w:b/>
-          <w:color w:val="000000" w:themeColor="text1"/>
-        </w:rPr>
-        <w:t xml:space="preserve">Grayscale: </w:t>
-      </w:r>
-      <w:r>
-        <w:rPr>
-          <w:color w:val="000000" w:themeColor="text1"/>
-        </w:rPr>
-        <w:t>cv::cvtColor (BGR→GRAY) — reduces color complexity, focuses on luminance.</w:t>
-      </w:r>
-    </w:p>
-    <w:p>
-      <w:pPr>
-        <w:pStyle w:val="ListNumber"/>
-        <w:rPr>
-          <w:color w:val="000000" w:themeColor="text1"/>
-        </w:rPr>
-      </w:pPr>
-      <w:r>
-        <w:rPr>
-          <w:b/>
-          <w:color w:val="000000" w:themeColor="text1"/>
-        </w:rPr>
-        <w:t xml:space="preserve">Gaussian Blur: </w:t>
-      </w:r>
-      <w:r>
-        <w:rPr>
-          <w:color w:val="000000" w:themeColor="text1"/>
-        </w:rPr>
-        <w:t>cv::GaussianBlur (5×5 kernel, σ=1.5) — suppresses high-frequency noise before edge detection.</w:t>
-      </w:r>
-    </w:p>
-    <w:p>
-      <w:pPr>
-        <w:pStyle w:val="ListNumber"/>
-        <w:rPr>
-          <w:color w:val="000000" w:themeColor="text1"/>
-        </w:rPr>
-      </w:pPr>
-      <w:r>
-        <w:rPr>
-          <w:b/>
-          <w:color w:val="000000" w:themeColor="text1"/>
-        </w:rPr>
-        <w:t xml:space="preserve">ROI Extraction: </w:t>
-      </w:r>
-      <w:r>
-        <w:rPr>
-          <w:color w:val="000000" w:themeColor="text1"/>
-        </w:rPr>
-        <w:t>Each parking space is a manually traced quadrilateral polygon. cv::boundingRect extracts the bounding box; cv::fillConvexPoly builds a pixel mask for the exact polygon shape.</w:t>
-      </w:r>
-    </w:p>
-    <w:p>
-      <w:pPr>
-        <w:pStyle w:val="ListNumber"/>
-        <w:rPr>
-          <w:color w:val="000000" w:themeColor="text1"/>
-        </w:rPr>
-      </w:pPr>
-      <w:r>
-        <w:rPr>
-          <w:b/>
-          <w:color w:val="000000" w:themeColor="text1"/>
-        </w:rPr>
-        <w:t xml:space="preserve">Signal 1 — Edges: </w:t>
-      </w:r>
-      <w:r>
-        <w:rPr>
-          <w:color w:val="000000" w:themeColor="text1"/>
-        </w:rPr>
-        <w:t>cv::Canny (low=50, high=150) applied within the masked ROI. cv::countNonZero sums the edge pixel count.</w:t>
-      </w:r>
-    </w:p>
-    <w:p>
-      <w:pPr>
-        <w:pStyle w:val="ListNumber"/>
-        <w:rPr>
-          <w:color w:val="000000" w:themeColor="text1"/>
-        </w:rPr>
-      </w:pPr>
-      <w:r>
-        <w:rPr>
-          <w:b/>
-          <w:color w:val="000000" w:themeColor="text1"/>
-        </w:rPr>
-        <w:t xml:space="preserve">Signal 2 — Variance: </w:t>
-      </w:r>
-      <w:r>
-        <w:rPr>
-          <w:color w:val="000000" w:themeColor="text1"/>
-        </w:rPr>
-        <w:t>cv::meanStdDev on the masked ROI pixels. Empty pavement is spectrally uniform (low σ); vehicles introduce texture and shadow (high σ).</w:t>
-      </w:r>
-    </w:p>
-    <w:p>
-      <w:pPr>
-        <w:pStyle w:val="ListNumber"/>
-        <w:rPr>
-          <w:color w:val="000000" w:themeColor="text1"/>
-        </w:rPr>
-      </w:pPr>
-      <w:r>
-        <w:rPr>
-          <w:b/>
-          <w:color w:val="000000" w:themeColor="text1"/>
-        </w:rPr>
-        <w:lastRenderedPageBreak/>
-        <w:t xml:space="preserve">Classification: </w:t>
-      </w:r>
-      <w:r>
-        <w:rPr>
-          <w:color w:val="000000" w:themeColor="text1"/>
-        </w:rPr>
-        <w:t>OCCUPIED if edgeCount &gt; edgeThreshold OR stddev &gt; varianceThreshold. Both thresholds are calibrated per lot on an empty reference image (threshold = observed maximum + 10 margin).</w:t>
-      </w:r>
-    </w:p>
-    <w:p>
-      <w:pPr>
-        <w:pStyle w:val="ListNumber"/>
-        <w:rPr>
-          <w:color w:val="000000" w:themeColor="text1"/>
-        </w:rPr>
-      </w:pPr>
-      <w:r>
-        <w:rPr>
-          <w:b/>
-          <w:color w:val="000000" w:themeColor="text1"/>
-        </w:rPr>
-        <w:t xml:space="preserve">Visualization: </w:t>
-      </w:r>
-      <w:r>
-        <w:rPr>
-          <w:color w:val="000000" w:themeColor="text1"/>
-        </w:rPr>
-        <w:t>cv::polylines draws red (OCCUPIED) or green (EMPTY) polygon outlines. cv::putText overlays OCC/EMP labels and a total count.</w:t>
-      </w:r>
-    </w:p>
-    <w:p>
-      <w:pPr>
-        <w:pStyle w:val="ListNumber"/>
-        <w:rPr>
-          <w:color w:val="000000" w:themeColor="text1"/>
-        </w:rPr>
-      </w:pPr>
-      <w:r>
-        <w:rPr>
-          <w:b/>
-          <w:color w:val="000000" w:themeColor="text1"/>
-        </w:rPr>
-        <w:t xml:space="preserve">Output: </w:t>
-      </w:r>
-      <w:r>
-        <w:rPr>
-          <w:color w:val="000000" w:themeColor="text1"/>
-        </w:rPr>
-        <w:t>Annotated image saved to output/ via cv::imwrite; displayed via cv::imshow.</w:t>
-      </w:r>
-    </w:p>
-    <w:p>
-      <w:pPr>
-        <w:pStyle w:val="Heading1"/>
-        <w:rPr>
-          <w:color w:val="000000" w:themeColor="text1"/>
-        </w:rPr>
-      </w:pPr>
-      <w:r>
-        <w:rPr>
-          <w:color w:val="000000" w:themeColor="text1"/>
-        </w:rPr>
-        <w:t>4. Implementation Details</w:t>
+        <w:t>3</w:t>
+      </w:r>
+      <w:r>
+        <w:rPr>
+          <w:color w:val="000000" w:themeColor="text1"/>
+        </w:rPr>
+        <w:t>. Implementation Details</w:t>
       </w:r>
     </w:p>
     <w:p>
@@ -481,7 +1429,19 @@
               <w:rPr>
                 <w:color w:val="000000" w:themeColor="text1"/>
               </w:rPr>
-              <w:t>Entry point: loads image, runs preprocessing, classification, and output</w:t>
+              <w:t>Entry point</w:t>
+            </w:r>
+            <w:r>
+              <w:rPr>
+                <w:color w:val="000000" w:themeColor="text1"/>
+              </w:rPr>
+              <w:t xml:space="preserve"> -</w:t>
+            </w:r>
+            <w:r>
+              <w:rPr>
+                <w:color w:val="000000" w:themeColor="text1"/>
+              </w:rPr>
+              <w:t xml:space="preserve"> loads image, runs preprocessing, classification, and output</w:t>
             </w:r>
           </w:p>
         </w:tc>
@@ -519,7 +1479,14 @@
               <w:rPr>
                 <w:color w:val="000000" w:themeColor="text1"/>
               </w:rPr>
-              <w:t>ROI definitions, classifySpaces(), drawResults(), getThreshold(), getVarianceThreshold()</w:t>
+              <w:t xml:space="preserve">ROI definitions, classifySpaces(), </w:t>
+            </w:r>
+            <w:r>
+              <w:rPr>
+                <w:color w:val="000000" w:themeColor="text1"/>
+              </w:rPr>
+              <w:lastRenderedPageBreak/>
+              <w:t>drawResults(), getThreshold(), getVarianceThreshold()</w:t>
             </w:r>
           </w:p>
         </w:tc>
@@ -539,6 +1506,7 @@
               <w:rPr>
                 <w:color w:val="000000" w:themeColor="text1"/>
               </w:rPr>
+              <w:lastRenderedPageBreak/>
               <w:t>parking.h</w:t>
             </w:r>
           </w:p>
@@ -632,7 +1600,51 @@
         <w:rPr>
           <w:color w:val="000000" w:themeColor="text1"/>
         </w:rPr>
-        <w:t>Thresholds are calibrated independently per parking lot by running the empty reference image, collecting all edge counts and stddev values, and setting threshold = max + 10. This ensures zero false positives on the calibration image.</w:t>
+        <w:t xml:space="preserve">Thresholds are calibrated independently </w:t>
+      </w:r>
+      <w:r>
+        <w:rPr>
+          <w:color w:val="000000" w:themeColor="text1"/>
+        </w:rPr>
+        <w:t xml:space="preserve">for each parking lot by first running the empty reference image, collecting all edge counts and </w:t>
+      </w:r>
+      <w:proofErr w:type="spellStart"/>
+      <w:r>
+        <w:rPr>
+          <w:color w:val="000000" w:themeColor="text1"/>
+        </w:rPr>
+        <w:t>stddev</w:t>
+      </w:r>
+      <w:proofErr w:type="spellEnd"/>
+      <w:r>
+        <w:rPr>
+          <w:color w:val="000000" w:themeColor="text1"/>
+        </w:rPr>
+        <w:t xml:space="preserve"> values, and setting threshold = max + 10. This </w:t>
+      </w:r>
+      <w:r>
+        <w:rPr>
+          <w:color w:val="000000" w:themeColor="text1"/>
+        </w:rPr>
+        <w:t>creates</w:t>
+      </w:r>
+      <w:r>
+        <w:rPr>
+          <w:color w:val="000000" w:themeColor="text1"/>
+        </w:rPr>
+        <w:t xml:space="preserve"> zero false positives on the </w:t>
+      </w:r>
+      <w:r>
+        <w:rPr>
+          <w:color w:val="000000" w:themeColor="text1"/>
+        </w:rPr>
+        <w:t>empty reference</w:t>
+      </w:r>
+      <w:r>
+        <w:rPr>
+          <w:color w:val="000000" w:themeColor="text1"/>
+        </w:rPr>
+        <w:t xml:space="preserve"> image.</w:t>
       </w:r>
     </w:p>
     <w:tbl>
@@ -1053,7 +2065,19 @@
         <w:rPr>
           <w:color w:val="000000" w:themeColor="text1"/>
         </w:rPr>
-        <w:t>Each parking space ROI is defined as a quadrilateral polygon (four corner points) traced interactively using a custom OpenCV mouse-callback tool. Clicking four corners per space produces polygon coordinates that are pasted directly into the source code. The polygon mask ensures edge detection and variance are computed only within the actual space boundary, not the surrounding pavement or line markings. 43 spaces are defined for the PUCPR lot, 257 for the UFPR04 lot, and 34 for the ANG lot.</w:t>
+        <w:t xml:space="preserve">Each parking space ROI is defined as a quadrilateral polygon (four corner points) traced </w:t>
+      </w:r>
+      <w:r>
+        <w:rPr>
+          <w:color w:val="000000" w:themeColor="text1"/>
+        </w:rPr>
+        <w:t>by hand</w:t>
+      </w:r>
+      <w:r>
+        <w:rPr>
+          <w:color w:val="000000" w:themeColor="text1"/>
+        </w:rPr>
+        <w:t xml:space="preserve"> using a custom OpenCV mouse-callback tool. Clicking four corners per space produces polygon coordinates that are pasted directly into the source code. The polygon mask ensures edge detection and variance are computed only within the actual space boundary, not the surrounding pavement or line markings. 43 spaces are defined for the PUCPR lot, 257 for the UFPR04 lot, and 34 for the ANG lot.</w:t>
       </w:r>
     </w:p>
     <w:p>
@@ -1067,8 +2091,13 @@
         <w:rPr>
           <w:color w:val="000000" w:themeColor="text1"/>
         </w:rPr>
-        <w:lastRenderedPageBreak/>
-        <w:t>5. Results</w:t>
+        <w:t>4</w:t>
+      </w:r>
+      <w:r>
+        <w:rPr>
+          <w:color w:val="000000" w:themeColor="text1"/>
+        </w:rPr>
+        <w:t>. Results</w:t>
       </w:r>
     </w:p>
     <w:p>
@@ -1081,7 +2110,43 @@
         <w:rPr>
           <w:color w:val="000000" w:themeColor="text1"/>
         </w:rPr>
-        <w:t>Results are reported for three images per lot. Thresholds were calibrated on PUCPR3.jpg (PUCPR), UFPR1.jpg (UFPR04), and ANG1.jpg (ANG), all mostly-empty reference images.</w:t>
+        <w:t>Results are reported for three images per lot. Thresholds were calibrated on PUCPR</w:t>
+      </w:r>
+      <w:r>
+        <w:rPr>
+          <w:color w:val="000000" w:themeColor="text1"/>
+        </w:rPr>
+        <w:t>1</w:t>
+      </w:r>
+      <w:r>
+        <w:rPr>
+          <w:color w:val="000000" w:themeColor="text1"/>
+        </w:rPr>
+        <w:t xml:space="preserve">.jpg (PUCPR), UFPR1.jpg (UFPR04), and ANG1.jpg (ANG), all </w:t>
+      </w:r>
+      <w:r>
+        <w:rPr>
+          <w:color w:val="000000" w:themeColor="text1"/>
+        </w:rPr>
+        <w:t>of which are empty</w:t>
+      </w:r>
+      <w:r>
+        <w:rPr>
+          <w:color w:val="000000" w:themeColor="text1"/>
+        </w:rPr>
+        <w:t xml:space="preserve"> </w:t>
+      </w:r>
+      <w:r>
+        <w:rPr>
+          <w:color w:val="000000" w:themeColor="text1"/>
+        </w:rPr>
+        <w:t xml:space="preserve">parking </w:t>
+      </w:r>
+      <w:r>
+        <w:rPr>
+          <w:color w:val="000000" w:themeColor="text1"/>
+        </w:rPr>
+        <w:t>reference images.</w:t>
       </w:r>
     </w:p>
     <w:p>
@@ -1095,7 +2160,169 @@
         <w:rPr>
           <w:color w:val="000000" w:themeColor="text1"/>
         </w:rPr>
+        <w:lastRenderedPageBreak/>
         <w:t>PUCPR Lot</w:t>
+      </w:r>
+      <w:r>
+        <w:rPr>
+          <w:color w:val="000000" w:themeColor="text1"/>
+        </w:rPr>
+        <w:t xml:space="preserve"> </w:t>
+      </w:r>
+      <w:r>
+        <w:rPr>
+          <w:b w:val="0"/>
+          <w:bCs w:val="0"/>
+          <w:color w:val="000000" w:themeColor="text1"/>
+          <w:sz w:val="22"/>
+          <w:szCs w:val="22"/>
+        </w:rPr>
+        <w:t>(PUCPR1.jpg, PUCPR2.jpg</w:t>
+      </w:r>
+      <w:r>
+        <w:rPr>
+          <w:b w:val="0"/>
+          <w:bCs w:val="0"/>
+          <w:color w:val="000000" w:themeColor="text1"/>
+          <w:sz w:val="22"/>
+          <w:szCs w:val="22"/>
+        </w:rPr>
+        <w:t>,</w:t>
+      </w:r>
+      <w:r>
+        <w:rPr>
+          <w:b w:val="0"/>
+          <w:bCs w:val="0"/>
+          <w:color w:val="000000" w:themeColor="text1"/>
+          <w:sz w:val="22"/>
+          <w:szCs w:val="22"/>
+        </w:rPr>
+        <w:t xml:space="preserve"> PUCPR3.jpg)</w:t>
+      </w:r>
+    </w:p>
+    <w:p>
+      <w:pPr>
+        <w:jc w:val="center"/>
+      </w:pPr>
+      <w:r>
+        <w:rPr>
+          <w:noProof/>
+        </w:rPr>
+        <w:drawing>
+          <wp:inline distT="0" distB="0" distL="0" distR="0" wp14:anchorId="6D852C74" wp14:editId="5EDBDF8C">
+            <wp:extent cx="2743200" cy="2743200"/>
+            <wp:effectExtent l="0" t="0" r="0" b="0"/>
+            <wp:docPr id="76061811" name="Picture 4"/>
+            <wp:cNvGraphicFramePr>
+              <a:graphicFrameLocks xmlns:a="http://schemas.openxmlformats.org/drawingml/2006/main" noChangeAspect="1"/>
+            </wp:cNvGraphicFramePr>
+            <a:graphic xmlns:a="http://schemas.openxmlformats.org/drawingml/2006/main">
+              <a:graphicData uri="http://schemas.openxmlformats.org/drawingml/2006/picture">
+                <pic:pic xmlns:pic="http://schemas.openxmlformats.org/drawingml/2006/picture">
+                  <pic:nvPicPr>
+                    <pic:cNvPr id="76061811" name="Picture 76061811"/>
+                    <pic:cNvPicPr/>
+                  </pic:nvPicPr>
+                  <pic:blipFill>
+                    <a:blip r:embed="rId13"/>
+                    <a:stretch>
+                      <a:fillRect/>
+                    </a:stretch>
+                  </pic:blipFill>
+                  <pic:spPr>
+                    <a:xfrm>
+                      <a:off x="0" y="0"/>
+                      <a:ext cx="2746874" cy="2746874"/>
+                    </a:xfrm>
+                    <a:prstGeom prst="rect">
+                      <a:avLst/>
+                    </a:prstGeom>
+                  </pic:spPr>
+                </pic:pic>
+              </a:graphicData>
+            </a:graphic>
+          </wp:inline>
+        </w:drawing>
+      </w:r>
+      <w:r>
+        <w:rPr>
+          <w:noProof/>
+        </w:rPr>
+        <w:drawing>
+          <wp:inline distT="0" distB="0" distL="0" distR="0" wp14:anchorId="482C33A2" wp14:editId="3A5338BB">
+            <wp:extent cx="2742875" cy="2742875"/>
+            <wp:effectExtent l="0" t="0" r="635" b="635"/>
+            <wp:docPr id="789362838" name="Picture 5"/>
+            <wp:cNvGraphicFramePr>
+              <a:graphicFrameLocks xmlns:a="http://schemas.openxmlformats.org/drawingml/2006/main" noChangeAspect="1"/>
+            </wp:cNvGraphicFramePr>
+            <a:graphic xmlns:a="http://schemas.openxmlformats.org/drawingml/2006/main">
+              <a:graphicData uri="http://schemas.openxmlformats.org/drawingml/2006/picture">
+                <pic:pic xmlns:pic="http://schemas.openxmlformats.org/drawingml/2006/picture">
+                  <pic:nvPicPr>
+                    <pic:cNvPr id="789362838" name="Picture 789362838"/>
+                    <pic:cNvPicPr/>
+                  </pic:nvPicPr>
+                  <pic:blipFill>
+                    <a:blip r:embed="rId14"/>
+                    <a:stretch>
+                      <a:fillRect/>
+                    </a:stretch>
+                  </pic:blipFill>
+                  <pic:spPr>
+                    <a:xfrm>
+                      <a:off x="0" y="0"/>
+                      <a:ext cx="2751418" cy="2751418"/>
+                    </a:xfrm>
+                    <a:prstGeom prst="rect">
+                      <a:avLst/>
+                    </a:prstGeom>
+                  </pic:spPr>
+                </pic:pic>
+              </a:graphicData>
+            </a:graphic>
+          </wp:inline>
+        </w:drawing>
+      </w:r>
+      <w:r>
+        <w:rPr>
+          <w:noProof/>
+        </w:rPr>
+        <w:drawing>
+          <wp:inline distT="0" distB="0" distL="0" distR="0" wp14:anchorId="271F9270" wp14:editId="37D0497C">
+            <wp:extent cx="2764465" cy="2764465"/>
+            <wp:effectExtent l="0" t="0" r="0" b="0"/>
+            <wp:docPr id="2139510033" name="Picture 6"/>
+            <wp:cNvGraphicFramePr>
+              <a:graphicFrameLocks xmlns:a="http://schemas.openxmlformats.org/drawingml/2006/main" noChangeAspect="1"/>
+            </wp:cNvGraphicFramePr>
+            <a:graphic xmlns:a="http://schemas.openxmlformats.org/drawingml/2006/main">
+              <a:graphicData uri="http://schemas.openxmlformats.org/drawingml/2006/picture">
+                <pic:pic xmlns:pic="http://schemas.openxmlformats.org/drawingml/2006/picture">
+                  <pic:nvPicPr>
+                    <pic:cNvPr id="2139510033" name="Picture 2139510033"/>
+                    <pic:cNvPicPr/>
+                  </pic:nvPicPr>
+                  <pic:blipFill>
+                    <a:blip r:embed="rId15"/>
+                    <a:stretch>
+                      <a:fillRect/>
+                    </a:stretch>
+                  </pic:blipFill>
+                  <pic:spPr>
+                    <a:xfrm>
+                      <a:off x="0" y="0"/>
+                      <a:ext cx="2782328" cy="2782328"/>
+                    </a:xfrm>
+                    <a:prstGeom prst="rect">
+                      <a:avLst/>
+                    </a:prstGeom>
+                  </pic:spPr>
+                </pic:pic>
+              </a:graphicData>
+            </a:graphic>
+          </wp:inline>
+        </w:drawing>
       </w:r>
     </w:p>
     <w:tbl>
@@ -1106,8 +2333,8 @@
       </w:tblPr>
       <w:tblGrid>
         <w:gridCol w:w="1728"/>
-        <w:gridCol w:w="1728"/>
-        <w:gridCol w:w="1728"/>
+        <w:gridCol w:w="1890"/>
+        <w:gridCol w:w="1566"/>
         <w:gridCol w:w="1728"/>
         <w:gridCol w:w="1728"/>
       </w:tblGrid>
@@ -1133,7 +2360,7 @@
         </w:tc>
         <w:tc>
           <w:tcPr>
-            <w:tcW w:w="1728" w:type="dxa"/>
+            <w:tcW w:w="1890" w:type="dxa"/>
           </w:tcPr>
           <w:p>
             <w:pPr>
@@ -1152,7 +2379,7 @@
         </w:tc>
         <w:tc>
           <w:tcPr>
-            <w:tcW w:w="1728" w:type="dxa"/>
+            <w:tcW w:w="1566" w:type="dxa"/>
           </w:tcPr>
           <w:p>
             <w:pPr>
@@ -1223,13 +2450,25 @@
               <w:rPr>
                 <w:color w:val="000000" w:themeColor="text1"/>
               </w:rPr>
-              <w:t>PUCPR3.jpg</w:t>
+              <w:t>PUCPR</w:t>
+            </w:r>
+            <w:r>
+              <w:rPr>
+                <w:color w:val="000000" w:themeColor="text1"/>
+              </w:rPr>
+              <w:t>1</w:t>
+            </w:r>
+            <w:r>
+              <w:rPr>
+                <w:color w:val="000000" w:themeColor="text1"/>
+              </w:rPr>
+              <w:t>.jpg</w:t>
             </w:r>
           </w:p>
         </w:tc>
         <w:tc>
           <w:tcPr>
-            <w:tcW w:w="1728" w:type="dxa"/>
+            <w:tcW w:w="1890" w:type="dxa"/>
           </w:tcPr>
           <w:p>
             <w:pPr>
@@ -1247,7 +2486,7 @@
         </w:tc>
         <w:tc>
           <w:tcPr>
-            <w:tcW w:w="1728" w:type="dxa"/>
+            <w:tcW w:w="1566" w:type="dxa"/>
           </w:tcPr>
           <w:p>
             <w:pPr>
@@ -1315,13 +2554,25 @@
               <w:rPr>
                 <w:color w:val="000000" w:themeColor="text1"/>
               </w:rPr>
-              <w:t>PUCPR1.jpg</w:t>
+              <w:t>PUCPR</w:t>
+            </w:r>
+            <w:r>
+              <w:rPr>
+                <w:color w:val="000000" w:themeColor="text1"/>
+              </w:rPr>
+              <w:t>2</w:t>
+            </w:r>
+            <w:r>
+              <w:rPr>
+                <w:color w:val="000000" w:themeColor="text1"/>
+              </w:rPr>
+              <w:t>.jpg</w:t>
             </w:r>
           </w:p>
         </w:tc>
         <w:tc>
           <w:tcPr>
-            <w:tcW w:w="1728" w:type="dxa"/>
+            <w:tcW w:w="1890" w:type="dxa"/>
           </w:tcPr>
           <w:p>
             <w:pPr>
@@ -1339,7 +2590,7 @@
         </w:tc>
         <w:tc>
           <w:tcPr>
-            <w:tcW w:w="1728" w:type="dxa"/>
+            <w:tcW w:w="1566" w:type="dxa"/>
           </w:tcPr>
           <w:p>
             <w:pPr>
@@ -1407,13 +2658,25 @@
               <w:rPr>
                 <w:color w:val="000000" w:themeColor="text1"/>
               </w:rPr>
-              <w:t>PUCPR2.jpg</w:t>
+              <w:t>PUCPR</w:t>
+            </w:r>
+            <w:r>
+              <w:rPr>
+                <w:color w:val="000000" w:themeColor="text1"/>
+              </w:rPr>
+              <w:t>3</w:t>
+            </w:r>
+            <w:r>
+              <w:rPr>
+                <w:color w:val="000000" w:themeColor="text1"/>
+              </w:rPr>
+              <w:t>.jpg</w:t>
             </w:r>
           </w:p>
         </w:tc>
         <w:tc>
           <w:tcPr>
-            <w:tcW w:w="1728" w:type="dxa"/>
+            <w:tcW w:w="1890" w:type="dxa"/>
           </w:tcPr>
           <w:p>
             <w:pPr>
@@ -1431,7 +2694,7 @@
         </w:tc>
         <w:tc>
           <w:tcPr>
-            <w:tcW w:w="1728" w:type="dxa"/>
+            <w:tcW w:w="1566" w:type="dxa"/>
           </w:tcPr>
           <w:p>
             <w:pPr>
@@ -1491,18 +2754,71 @@
           <w:color w:val="000000" w:themeColor="text1"/>
         </w:rPr>
       </w:pPr>
-    </w:p>
-    <w:p>
-      <w:pPr>
-        <w:rPr>
-          <w:color w:val="000000" w:themeColor="text1"/>
-        </w:rPr>
-      </w:pPr>
-      <w:r>
-        <w:rPr>
-          <w:color w:val="000000" w:themeColor="text1"/>
-        </w:rPr>
-        <w:t>PUCPR3 achieves zero false positives. For PUCPR1 and PUCPR2, minor classification errors remain due to signal overlap described in Section 6.</w:t>
+      <w:r>
+        <w:rPr>
+          <w:color w:val="000000" w:themeColor="text1"/>
+        </w:rPr>
+        <w:t>PUCPR</w:t>
+      </w:r>
+      <w:r>
+        <w:rPr>
+          <w:color w:val="000000" w:themeColor="text1"/>
+        </w:rPr>
+        <w:t>1</w:t>
+      </w:r>
+      <w:r>
+        <w:rPr>
+          <w:color w:val="000000" w:themeColor="text1"/>
+        </w:rPr>
+        <w:t xml:space="preserve"> achieves zero false positives. For PUCPR</w:t>
+      </w:r>
+      <w:r>
+        <w:rPr>
+          <w:color w:val="000000" w:themeColor="text1"/>
+        </w:rPr>
+        <w:t>3</w:t>
+      </w:r>
+      <w:r>
+        <w:rPr>
+          <w:color w:val="000000" w:themeColor="text1"/>
+        </w:rPr>
+        <w:t xml:space="preserve"> and PUCPR</w:t>
+      </w:r>
+      <w:r>
+        <w:rPr>
+          <w:color w:val="000000" w:themeColor="text1"/>
+        </w:rPr>
+        <w:t>3</w:t>
+      </w:r>
+      <w:r>
+        <w:rPr>
+          <w:color w:val="000000" w:themeColor="text1"/>
+        </w:rPr>
+        <w:t>, minor classification errors remain due to signal overlap</w:t>
+      </w:r>
+      <w:r>
+        <w:rPr>
+          <w:color w:val="000000" w:themeColor="text1"/>
+        </w:rPr>
+        <w:t xml:space="preserve"> and severe changes in brightness, as</w:t>
+      </w:r>
+      <w:r>
+        <w:rPr>
+          <w:color w:val="000000" w:themeColor="text1"/>
+        </w:rPr>
+        <w:t xml:space="preserve"> described in Section </w:t>
+      </w:r>
+      <w:r>
+        <w:rPr>
+          <w:color w:val="000000" w:themeColor="text1"/>
+        </w:rPr>
+        <w:t>5</w:t>
+      </w:r>
+      <w:r>
+        <w:rPr>
+          <w:color w:val="000000" w:themeColor="text1"/>
+        </w:rPr>
+        <w:t>.</w:t>
       </w:r>
     </w:p>
     <w:p>
@@ -1516,7 +2832,169 @@
         <w:rPr>
           <w:color w:val="000000" w:themeColor="text1"/>
         </w:rPr>
+        <w:lastRenderedPageBreak/>
         <w:t>UFPR04 Lot</w:t>
+      </w:r>
+      <w:r>
+        <w:rPr>
+          <w:color w:val="000000" w:themeColor="text1"/>
+        </w:rPr>
+        <w:t xml:space="preserve"> </w:t>
+      </w:r>
+      <w:r>
+        <w:rPr>
+          <w:b w:val="0"/>
+          <w:bCs w:val="0"/>
+          <w:color w:val="000000" w:themeColor="text1"/>
+          <w:sz w:val="22"/>
+          <w:szCs w:val="22"/>
+        </w:rPr>
+        <w:t>(</w:t>
+      </w:r>
+      <w:r>
+        <w:rPr>
+          <w:b w:val="0"/>
+          <w:bCs w:val="0"/>
+          <w:color w:val="000000" w:themeColor="text1"/>
+          <w:sz w:val="22"/>
+          <w:szCs w:val="22"/>
+        </w:rPr>
+        <w:t>UFPR1.jpg, UFPR2.jpg, UFPR3.jpg</w:t>
+      </w:r>
+      <w:r>
+        <w:rPr>
+          <w:b w:val="0"/>
+          <w:bCs w:val="0"/>
+          <w:color w:val="000000" w:themeColor="text1"/>
+          <w:sz w:val="22"/>
+          <w:szCs w:val="22"/>
+        </w:rPr>
+        <w:t>)</w:t>
+      </w:r>
+    </w:p>
+    <w:p>
+      <w:pPr>
+        <w:jc w:val="center"/>
+      </w:pPr>
+      <w:r>
+        <w:rPr>
+          <w:noProof/>
+        </w:rPr>
+        <w:drawing>
+          <wp:inline distT="0" distB="0" distL="0" distR="0" wp14:anchorId="43E86D09" wp14:editId="774CFBCC">
+            <wp:extent cx="2690037" cy="2690037"/>
+            <wp:effectExtent l="0" t="0" r="0" b="0"/>
+            <wp:docPr id="410132033" name="Picture 7"/>
+            <wp:cNvGraphicFramePr>
+              <a:graphicFrameLocks xmlns:a="http://schemas.openxmlformats.org/drawingml/2006/main" noChangeAspect="1"/>
+            </wp:cNvGraphicFramePr>
+            <a:graphic xmlns:a="http://schemas.openxmlformats.org/drawingml/2006/main">
+              <a:graphicData uri="http://schemas.openxmlformats.org/drawingml/2006/picture">
+                <pic:pic xmlns:pic="http://schemas.openxmlformats.org/drawingml/2006/picture">
+                  <pic:nvPicPr>
+                    <pic:cNvPr id="410132033" name="Picture 410132033"/>
+                    <pic:cNvPicPr/>
+                  </pic:nvPicPr>
+                  <pic:blipFill>
+                    <a:blip r:embed="rId16"/>
+                    <a:stretch>
+                      <a:fillRect/>
+                    </a:stretch>
+                  </pic:blipFill>
+                  <pic:spPr>
+                    <a:xfrm>
+                      <a:off x="0" y="0"/>
+                      <a:ext cx="2699153" cy="2699153"/>
+                    </a:xfrm>
+                    <a:prstGeom prst="rect">
+                      <a:avLst/>
+                    </a:prstGeom>
+                  </pic:spPr>
+                </pic:pic>
+              </a:graphicData>
+            </a:graphic>
+          </wp:inline>
+        </w:drawing>
+      </w:r>
+      <w:r>
+        <w:rPr>
+          <w:noProof/>
+        </w:rPr>
+        <w:drawing>
+          <wp:inline distT="0" distB="0" distL="0" distR="0" wp14:anchorId="2EE9AF46" wp14:editId="61968C5D">
+            <wp:extent cx="2679404" cy="2679404"/>
+            <wp:effectExtent l="0" t="0" r="6985" b="6985"/>
+            <wp:docPr id="1653888228" name="Picture 8"/>
+            <wp:cNvGraphicFramePr>
+              <a:graphicFrameLocks xmlns:a="http://schemas.openxmlformats.org/drawingml/2006/main" noChangeAspect="1"/>
+            </wp:cNvGraphicFramePr>
+            <a:graphic xmlns:a="http://schemas.openxmlformats.org/drawingml/2006/main">
+              <a:graphicData uri="http://schemas.openxmlformats.org/drawingml/2006/picture">
+                <pic:pic xmlns:pic="http://schemas.openxmlformats.org/drawingml/2006/picture">
+                  <pic:nvPicPr>
+                    <pic:cNvPr id="1653888228" name="Picture 1653888228"/>
+                    <pic:cNvPicPr/>
+                  </pic:nvPicPr>
+                  <pic:blipFill>
+                    <a:blip r:embed="rId17"/>
+                    <a:stretch>
+                      <a:fillRect/>
+                    </a:stretch>
+                  </pic:blipFill>
+                  <pic:spPr>
+                    <a:xfrm>
+                      <a:off x="0" y="0"/>
+                      <a:ext cx="2689509" cy="2689509"/>
+                    </a:xfrm>
+                    <a:prstGeom prst="rect">
+                      <a:avLst/>
+                    </a:prstGeom>
+                  </pic:spPr>
+                </pic:pic>
+              </a:graphicData>
+            </a:graphic>
+          </wp:inline>
+        </w:drawing>
+      </w:r>
+      <w:r>
+        <w:rPr>
+          <w:noProof/>
+        </w:rPr>
+        <w:drawing>
+          <wp:inline distT="0" distB="0" distL="0" distR="0" wp14:anchorId="5170E71B" wp14:editId="3426BF7F">
+            <wp:extent cx="2679405" cy="2679405"/>
+            <wp:effectExtent l="0" t="0" r="6985" b="6985"/>
+            <wp:docPr id="1865172387" name="Picture 9"/>
+            <wp:cNvGraphicFramePr>
+              <a:graphicFrameLocks xmlns:a="http://schemas.openxmlformats.org/drawingml/2006/main" noChangeAspect="1"/>
+            </wp:cNvGraphicFramePr>
+            <a:graphic xmlns:a="http://schemas.openxmlformats.org/drawingml/2006/main">
+              <a:graphicData uri="http://schemas.openxmlformats.org/drawingml/2006/picture">
+                <pic:pic xmlns:pic="http://schemas.openxmlformats.org/drawingml/2006/picture">
+                  <pic:nvPicPr>
+                    <pic:cNvPr id="1865172387" name="Picture 1865172387"/>
+                    <pic:cNvPicPr/>
+                  </pic:nvPicPr>
+                  <pic:blipFill>
+                    <a:blip r:embed="rId18"/>
+                    <a:stretch>
+                      <a:fillRect/>
+                    </a:stretch>
+                  </pic:blipFill>
+                  <pic:spPr>
+                    <a:xfrm>
+                      <a:off x="0" y="0"/>
+                      <a:ext cx="2687219" cy="2687219"/>
+                    </a:xfrm>
+                    <a:prstGeom prst="rect">
+                      <a:avLst/>
+                    </a:prstGeom>
+                  </pic:spPr>
+                </pic:pic>
+              </a:graphicData>
+            </a:graphic>
+          </wp:inline>
+        </w:drawing>
       </w:r>
     </w:p>
     <w:tbl>
@@ -1527,8 +3005,8 @@
       </w:tblPr>
       <w:tblGrid>
         <w:gridCol w:w="1728"/>
-        <w:gridCol w:w="1728"/>
-        <w:gridCol w:w="1728"/>
+        <w:gridCol w:w="1890"/>
+        <w:gridCol w:w="1566"/>
         <w:gridCol w:w="1728"/>
         <w:gridCol w:w="1728"/>
       </w:tblGrid>
@@ -1554,7 +3032,7 @@
         </w:tc>
         <w:tc>
           <w:tcPr>
-            <w:tcW w:w="1728" w:type="dxa"/>
+            <w:tcW w:w="1890" w:type="dxa"/>
           </w:tcPr>
           <w:p>
             <w:pPr>
@@ -1573,7 +3051,7 @@
         </w:tc>
         <w:tc>
           <w:tcPr>
-            <w:tcW w:w="1728" w:type="dxa"/>
+            <w:tcW w:w="1566" w:type="dxa"/>
           </w:tcPr>
           <w:p>
             <w:pPr>
@@ -1650,7 +3128,7 @@
         </w:tc>
         <w:tc>
           <w:tcPr>
-            <w:tcW w:w="1728" w:type="dxa"/>
+            <w:tcW w:w="1890" w:type="dxa"/>
           </w:tcPr>
           <w:p>
             <w:pPr>
@@ -1668,7 +3146,7 @@
         </w:tc>
         <w:tc>
           <w:tcPr>
-            <w:tcW w:w="1728" w:type="dxa"/>
+            <w:tcW w:w="1566" w:type="dxa"/>
           </w:tcPr>
           <w:p>
             <w:pPr>
@@ -1742,7 +3220,7 @@
         </w:tc>
         <w:tc>
           <w:tcPr>
-            <w:tcW w:w="1728" w:type="dxa"/>
+            <w:tcW w:w="1890" w:type="dxa"/>
           </w:tcPr>
           <w:p>
             <w:pPr>
@@ -1760,7 +3238,7 @@
         </w:tc>
         <w:tc>
           <w:tcPr>
-            <w:tcW w:w="1728" w:type="dxa"/>
+            <w:tcW w:w="1566" w:type="dxa"/>
           </w:tcPr>
           <w:p>
             <w:pPr>
@@ -1834,7 +3312,7 @@
         </w:tc>
         <w:tc>
           <w:tcPr>
-            <w:tcW w:w="1728" w:type="dxa"/>
+            <w:tcW w:w="1890" w:type="dxa"/>
           </w:tcPr>
           <w:p>
             <w:pPr>
@@ -1852,7 +3330,7 @@
         </w:tc>
         <w:tc>
           <w:tcPr>
-            <w:tcW w:w="1728" w:type="dxa"/>
+            <w:tcW w:w="1566" w:type="dxa"/>
           </w:tcPr>
           <w:p>
             <w:pPr>
@@ -1912,24 +3390,55 @@
           <w:color w:val="000000" w:themeColor="text1"/>
         </w:rPr>
       </w:pPr>
-    </w:p>
-    <w:p>
-      <w:pPr>
-        <w:rPr>
-          <w:color w:val="000000" w:themeColor="text1"/>
-        </w:rPr>
-      </w:pPr>
-      <w:r>
-        <w:rPr>
-          <w:color w:val="000000" w:themeColor="text1"/>
-        </w:rPr>
-        <w:t>UFPR1 achieves zero false positives on the calibration image. UFPR2 is highly accurate. UFPR3 contains low-contrast vehicles that produce insufficient edge and variance signal to cross the threshold — a known limitation of the approach described in Section 6. Annotated output images are included in the output/ directory.</w:t>
+      <w:r>
+        <w:rPr>
+          <w:color w:val="000000" w:themeColor="text1"/>
+        </w:rPr>
+        <w:t>UFPR1 achieves zero false positives on the calibration image. UFPR2 is highly accurate. UFPR3 contains low-contrast vehicles that produce insufficient edge and variance signal to cross the threshold</w:t>
+      </w:r>
+      <w:r>
+        <w:rPr>
+          <w:color w:val="000000" w:themeColor="text1"/>
+        </w:rPr>
+        <w:t>,</w:t>
+      </w:r>
+      <w:r>
+        <w:rPr>
+          <w:color w:val="000000" w:themeColor="text1"/>
+        </w:rPr>
+        <w:t xml:space="preserve"> </w:t>
+      </w:r>
+      <w:r>
+        <w:rPr>
+          <w:color w:val="000000" w:themeColor="text1"/>
+        </w:rPr>
+        <w:t>which we found to be</w:t>
+      </w:r>
+      <w:r>
+        <w:rPr>
+          <w:color w:val="000000" w:themeColor="text1"/>
+        </w:rPr>
+        <w:t xml:space="preserve"> a known limitation of the approach described in Section </w:t>
+      </w:r>
+      <w:r>
+        <w:rPr>
+          <w:color w:val="000000" w:themeColor="text1"/>
+        </w:rPr>
+        <w:t>5</w:t>
+      </w:r>
+      <w:r>
+        <w:rPr>
+          <w:color w:val="000000" w:themeColor="text1"/>
+        </w:rPr>
+        <w:t xml:space="preserve">. </w:t>
       </w:r>
     </w:p>
     <w:p>
       <w:pPr>
         <w:pStyle w:val="Heading2"/>
         <w:rPr>
+          <w:b w:val="0"/>
+          <w:bCs w:val="0"/>
           <w:color w:val="000000" w:themeColor="text1"/>
         </w:rPr>
       </w:pPr>
@@ -1937,7 +3446,169 @@
         <w:rPr>
           <w:color w:val="000000" w:themeColor="text1"/>
         </w:rPr>
+        <w:lastRenderedPageBreak/>
         <w:t>ANG Lot</w:t>
+      </w:r>
+      <w:r>
+        <w:rPr>
+          <w:color w:val="000000" w:themeColor="text1"/>
+        </w:rPr>
+        <w:t xml:space="preserve"> </w:t>
+      </w:r>
+      <w:r>
+        <w:rPr>
+          <w:b w:val="0"/>
+          <w:bCs w:val="0"/>
+          <w:color w:val="000000" w:themeColor="text1"/>
+          <w:sz w:val="22"/>
+          <w:szCs w:val="22"/>
+        </w:rPr>
+        <w:t>(</w:t>
+      </w:r>
+      <w:r>
+        <w:rPr>
+          <w:b w:val="0"/>
+          <w:bCs w:val="0"/>
+          <w:color w:val="000000" w:themeColor="text1"/>
+          <w:sz w:val="22"/>
+          <w:szCs w:val="22"/>
+        </w:rPr>
+        <w:t>ANG1.jpg, ANG2.jpg, ANG3.jpg</w:t>
+      </w:r>
+      <w:r>
+        <w:rPr>
+          <w:b w:val="0"/>
+          <w:bCs w:val="0"/>
+          <w:color w:val="000000" w:themeColor="text1"/>
+          <w:sz w:val="22"/>
+          <w:szCs w:val="22"/>
+        </w:rPr>
+        <w:t>)</w:t>
+      </w:r>
+    </w:p>
+    <w:p>
+      <w:pPr>
+        <w:jc w:val="center"/>
+      </w:pPr>
+      <w:r>
+        <w:rPr>
+          <w:noProof/>
+        </w:rPr>
+        <w:drawing>
+          <wp:inline distT="0" distB="0" distL="0" distR="0" wp14:anchorId="03C4336E" wp14:editId="495E2CA3">
+            <wp:extent cx="2732567" cy="2732567"/>
+            <wp:effectExtent l="0" t="0" r="0" b="0"/>
+            <wp:docPr id="1341968606" name="Picture 10"/>
+            <wp:cNvGraphicFramePr>
+              <a:graphicFrameLocks xmlns:a="http://schemas.openxmlformats.org/drawingml/2006/main" noChangeAspect="1"/>
+            </wp:cNvGraphicFramePr>
+            <a:graphic xmlns:a="http://schemas.openxmlformats.org/drawingml/2006/main">
+              <a:graphicData uri="http://schemas.openxmlformats.org/drawingml/2006/picture">
+                <pic:pic xmlns:pic="http://schemas.openxmlformats.org/drawingml/2006/picture">
+                  <pic:nvPicPr>
+                    <pic:cNvPr id="1341968606" name="Picture 1341968606"/>
+                    <pic:cNvPicPr/>
+                  </pic:nvPicPr>
+                  <pic:blipFill>
+                    <a:blip r:embed="rId19"/>
+                    <a:stretch>
+                      <a:fillRect/>
+                    </a:stretch>
+                  </pic:blipFill>
+                  <pic:spPr>
+                    <a:xfrm>
+                      <a:off x="0" y="0"/>
+                      <a:ext cx="2737411" cy="2737411"/>
+                    </a:xfrm>
+                    <a:prstGeom prst="rect">
+                      <a:avLst/>
+                    </a:prstGeom>
+                  </pic:spPr>
+                </pic:pic>
+              </a:graphicData>
+            </a:graphic>
+          </wp:inline>
+        </w:drawing>
+      </w:r>
+      <w:r>
+        <w:rPr>
+          <w:noProof/>
+        </w:rPr>
+        <w:drawing>
+          <wp:inline distT="0" distB="0" distL="0" distR="0" wp14:anchorId="78B4841F" wp14:editId="7358DEDC">
+            <wp:extent cx="2732568" cy="2732568"/>
+            <wp:effectExtent l="0" t="0" r="0" b="0"/>
+            <wp:docPr id="785440396" name="Picture 11"/>
+            <wp:cNvGraphicFramePr>
+              <a:graphicFrameLocks xmlns:a="http://schemas.openxmlformats.org/drawingml/2006/main" noChangeAspect="1"/>
+            </wp:cNvGraphicFramePr>
+            <a:graphic xmlns:a="http://schemas.openxmlformats.org/drawingml/2006/main">
+              <a:graphicData uri="http://schemas.openxmlformats.org/drawingml/2006/picture">
+                <pic:pic xmlns:pic="http://schemas.openxmlformats.org/drawingml/2006/picture">
+                  <pic:nvPicPr>
+                    <pic:cNvPr id="785440396" name="Picture 785440396"/>
+                    <pic:cNvPicPr/>
+                  </pic:nvPicPr>
+                  <pic:blipFill>
+                    <a:blip r:embed="rId20"/>
+                    <a:stretch>
+                      <a:fillRect/>
+                    </a:stretch>
+                  </pic:blipFill>
+                  <pic:spPr>
+                    <a:xfrm>
+                      <a:off x="0" y="0"/>
+                      <a:ext cx="2738598" cy="2738598"/>
+                    </a:xfrm>
+                    <a:prstGeom prst="rect">
+                      <a:avLst/>
+                    </a:prstGeom>
+                  </pic:spPr>
+                </pic:pic>
+              </a:graphicData>
+            </a:graphic>
+          </wp:inline>
+        </w:drawing>
+      </w:r>
+      <w:r>
+        <w:rPr>
+          <w:noProof/>
+        </w:rPr>
+        <w:drawing>
+          <wp:inline distT="0" distB="0" distL="0" distR="0" wp14:anchorId="7624F7D0" wp14:editId="65B92244">
+            <wp:extent cx="2721935" cy="2721935"/>
+            <wp:effectExtent l="0" t="0" r="2540" b="2540"/>
+            <wp:docPr id="763480002" name="Picture 12"/>
+            <wp:cNvGraphicFramePr>
+              <a:graphicFrameLocks xmlns:a="http://schemas.openxmlformats.org/drawingml/2006/main" noChangeAspect="1"/>
+            </wp:cNvGraphicFramePr>
+            <a:graphic xmlns:a="http://schemas.openxmlformats.org/drawingml/2006/main">
+              <a:graphicData uri="http://schemas.openxmlformats.org/drawingml/2006/picture">
+                <pic:pic xmlns:pic="http://schemas.openxmlformats.org/drawingml/2006/picture">
+                  <pic:nvPicPr>
+                    <pic:cNvPr id="763480002" name="Picture 763480002"/>
+                    <pic:cNvPicPr/>
+                  </pic:nvPicPr>
+                  <pic:blipFill>
+                    <a:blip r:embed="rId21"/>
+                    <a:stretch>
+                      <a:fillRect/>
+                    </a:stretch>
+                  </pic:blipFill>
+                  <pic:spPr>
+                    <a:xfrm>
+                      <a:off x="0" y="0"/>
+                      <a:ext cx="2723395" cy="2723395"/>
+                    </a:xfrm>
+                    <a:prstGeom prst="rect">
+                      <a:avLst/>
+                    </a:prstGeom>
+                  </pic:spPr>
+                </pic:pic>
+              </a:graphicData>
+            </a:graphic>
+          </wp:inline>
+        </w:drawing>
       </w:r>
     </w:p>
     <w:tbl>
@@ -1948,8 +3619,8 @@
       </w:tblPr>
       <w:tblGrid>
         <w:gridCol w:w="1728"/>
-        <w:gridCol w:w="1728"/>
-        <w:gridCol w:w="1728"/>
+        <w:gridCol w:w="1890"/>
+        <w:gridCol w:w="1566"/>
         <w:gridCol w:w="1728"/>
         <w:gridCol w:w="1728"/>
       </w:tblGrid>
@@ -1975,7 +3646,7 @@
         </w:tc>
         <w:tc>
           <w:tcPr>
-            <w:tcW w:w="1728" w:type="dxa"/>
+            <w:tcW w:w="1890" w:type="dxa"/>
           </w:tcPr>
           <w:p>
             <w:pPr>
@@ -1994,7 +3665,7 @@
         </w:tc>
         <w:tc>
           <w:tcPr>
-            <w:tcW w:w="1728" w:type="dxa"/>
+            <w:tcW w:w="1566" w:type="dxa"/>
           </w:tcPr>
           <w:p>
             <w:pPr>
@@ -2071,7 +3742,7 @@
         </w:tc>
         <w:tc>
           <w:tcPr>
-            <w:tcW w:w="1728" w:type="dxa"/>
+            <w:tcW w:w="1890" w:type="dxa"/>
           </w:tcPr>
           <w:p>
             <w:pPr>
@@ -2089,7 +3760,7 @@
         </w:tc>
         <w:tc>
           <w:tcPr>
-            <w:tcW w:w="1728" w:type="dxa"/>
+            <w:tcW w:w="1566" w:type="dxa"/>
           </w:tcPr>
           <w:p>
             <w:pPr>
@@ -2163,7 +3834,7 @@
         </w:tc>
         <w:tc>
           <w:tcPr>
-            <w:tcW w:w="1728" w:type="dxa"/>
+            <w:tcW w:w="1890" w:type="dxa"/>
           </w:tcPr>
           <w:p>
             <w:pPr>
@@ -2181,7 +3852,7 @@
         </w:tc>
         <w:tc>
           <w:tcPr>
-            <w:tcW w:w="1728" w:type="dxa"/>
+            <w:tcW w:w="1566" w:type="dxa"/>
           </w:tcPr>
           <w:p>
             <w:pPr>
@@ -2255,7 +3926,7 @@
         </w:tc>
         <w:tc>
           <w:tcPr>
-            <w:tcW w:w="1728" w:type="dxa"/>
+            <w:tcW w:w="1890" w:type="dxa"/>
           </w:tcPr>
           <w:p>
             <w:pPr>
@@ -2273,7 +3944,7 @@
         </w:tc>
         <w:tc>
           <w:tcPr>
-            <w:tcW w:w="1728" w:type="dxa"/>
+            <w:tcW w:w="1566" w:type="dxa"/>
           </w:tcPr>
           <w:p>
             <w:pPr>
@@ -2333,18 +4004,17 @@
           <w:color w:val="000000" w:themeColor="text1"/>
         </w:rPr>
       </w:pPr>
-    </w:p>
-    <w:p>
-      <w:pPr>
-        <w:rPr>
-          <w:color w:val="000000" w:themeColor="text1"/>
-        </w:rPr>
-      </w:pPr>
-      <w:r>
-        <w:rPr>
-          <w:color w:val="000000" w:themeColor="text1"/>
-        </w:rPr>
-        <w:t>ANG1 achieves zero false positives on the calibration image. ANG2 is highly accurate. ANG3 retains a small number of misses due to the same low-contrast vehicle overlap described in Section 6.</w:t>
+      <w:r>
+        <w:rPr>
+          <w:color w:val="000000" w:themeColor="text1"/>
+        </w:rPr>
+        <w:t>ANG1 achieves zero false positives on the calibration image. ANG2 is highly accurate. ANG3 retains a small number of misses due to the same low-contrast vehicle overlap</w:t>
+      </w:r>
+      <w:r>
+        <w:rPr>
+          <w:color w:val="000000" w:themeColor="text1"/>
+        </w:rPr>
+        <w:t>.</w:t>
       </w:r>
     </w:p>
     <w:p>
@@ -2359,7 +4029,13 @@
           <w:color w:val="000000" w:themeColor="text1"/>
         </w:rPr>
         <w:lastRenderedPageBreak/>
-        <w:t>6. Challenges</w:t>
+        <w:t>5</w:t>
+      </w:r>
+      <w:r>
+        <w:rPr>
+          <w:color w:val="000000" w:themeColor="text1"/>
+        </w:rPr>
+        <w:t>. Challenges</w:t>
       </w:r>
     </w:p>
     <w:p>
@@ -2386,7 +4062,43 @@
         <w:rPr>
           <w:color w:val="000000" w:themeColor="text1"/>
         </w:rPr>
-        <w:t>The fundamental challenge is that edge count and intensity variance distributions for "empty space with strong line markings or shadows" and "car with low contrast against pavement" partially overlap. A threshold high enough to eliminate all false positives on empty spaces will inevitably miss low-contrast vehicles, and vice versa. This overlap is an inherent property of the feature space, not a tuning failure.</w:t>
+        <w:t xml:space="preserve">The </w:t>
+      </w:r>
+      <w:r>
+        <w:rPr>
+          <w:color w:val="000000" w:themeColor="text1"/>
+        </w:rPr>
+        <w:t>main</w:t>
+      </w:r>
+      <w:r>
+        <w:rPr>
+          <w:color w:val="000000" w:themeColor="text1"/>
+        </w:rPr>
+        <w:t xml:space="preserve"> challenge is that edge count and intensity variance distributions for "empty space with strong line markings or shadows" and "car with low contrast against pavement" partially overlap. A threshold high enough to eliminate all false positives on empty spaces will inevitably miss low-contrast vehicles, and vice versa. This overlap </w:t>
+      </w:r>
+      <w:r>
+        <w:rPr>
+          <w:color w:val="000000" w:themeColor="text1"/>
+        </w:rPr>
+        <w:t>is a problem coming from</w:t>
+      </w:r>
+      <w:r>
+        <w:rPr>
+          <w:color w:val="000000" w:themeColor="text1"/>
+        </w:rPr>
+        <w:t xml:space="preserve"> the feature space, not </w:t>
+      </w:r>
+      <w:r>
+        <w:rPr>
+          <w:color w:val="000000" w:themeColor="text1"/>
+        </w:rPr>
+        <w:t xml:space="preserve">necessarily a </w:t>
+      </w:r>
+      <w:r>
+        <w:rPr>
+          <w:color w:val="000000" w:themeColor="text1"/>
+        </w:rPr>
+        <w:t>tuning failure.</w:t>
       </w:r>
     </w:p>
     <w:p>
@@ -2440,7 +4152,43 @@
         <w:rPr>
           <w:color w:val="000000" w:themeColor="text1"/>
         </w:rPr>
-        <w:t>Shadows from trees, light poles, and adjacent vehicles create high-variance or high-edge-count regions in otherwise empty spaces. The overhead perspective also introduces scale variation — spaces further from the camera appear smaller, which can affect edge density normalization.</w:t>
+        <w:t>Shadows from trees, light poles, and adjacent vehicles create high-variance or high-edge-count regions in otherwise empty spaces. The</w:t>
+      </w:r>
+      <w:r>
+        <w:rPr>
+          <w:color w:val="000000" w:themeColor="text1"/>
+        </w:rPr>
+        <w:t xml:space="preserve"> angled</w:t>
+      </w:r>
+      <w:r>
+        <w:rPr>
+          <w:color w:val="000000" w:themeColor="text1"/>
+        </w:rPr>
+        <w:t xml:space="preserve"> overhead perspective also introduces scale variation</w:t>
+      </w:r>
+      <w:r>
+        <w:rPr>
+          <w:color w:val="000000" w:themeColor="text1"/>
+        </w:rPr>
+        <w:t>;</w:t>
+      </w:r>
+      <w:r>
+        <w:rPr>
+          <w:color w:val="000000" w:themeColor="text1"/>
+        </w:rPr>
+        <w:t xml:space="preserve"> spaces </w:t>
+      </w:r>
+      <w:r>
+        <w:rPr>
+          <w:color w:val="000000" w:themeColor="text1"/>
+        </w:rPr>
+        <w:t>farther from the camera appear smaller, which can affect edge-density</w:t>
+      </w:r>
+      <w:r>
+        <w:rPr>
+          <w:color w:val="000000" w:themeColor="text1"/>
+        </w:rPr>
+        <w:t xml:space="preserve"> normalization.</w:t>
       </w:r>
     </w:p>
     <w:p>
@@ -2467,7 +4215,659 @@
         <w:rPr>
           <w:color w:val="000000" w:themeColor="text1"/>
         </w:rPr>
-        <w:t>Lowering Canny thresholds from (50, 150) to (30, 90) was explored to improve recall on low-contrast vehicles. However, this increased the empty-space maximum edge count from 127 to 234 — requiring a threshold of 244, which misses most occupied spaces. The original (50, 150) configuration was retained.</w:t>
+        <w:t>Lowering Canny thresholds from (50, 150) to (30, 90) was explored to improve recall on low-contrast vehicles. However, this increased the empty-space maximum edge count from 127 to 234</w:t>
+      </w:r>
+      <w:r>
+        <w:rPr>
+          <w:color w:val="000000" w:themeColor="text1"/>
+        </w:rPr>
+        <w:t xml:space="preserve">, which would require a threshold of 244, leading to most </w:t>
+      </w:r>
+      <w:r>
+        <w:rPr>
+          <w:color w:val="000000" w:themeColor="text1"/>
+        </w:rPr>
+        <w:t>occupied spaces</w:t>
+      </w:r>
+      <w:r>
+        <w:rPr>
+          <w:color w:val="000000" w:themeColor="text1"/>
+        </w:rPr>
+        <w:t xml:space="preserve"> being considered empty</w:t>
+      </w:r>
+      <w:r>
+        <w:rPr>
+          <w:color w:val="000000" w:themeColor="text1"/>
+        </w:rPr>
+        <w:t>. The (50, 150) configuration was</w:t>
+      </w:r>
+      <w:r>
+        <w:rPr>
+          <w:color w:val="000000" w:themeColor="text1"/>
+        </w:rPr>
+        <w:t xml:space="preserve"> </w:t>
+      </w:r>
+      <w:proofErr w:type="gramStart"/>
+      <w:r>
+        <w:rPr>
+          <w:color w:val="000000" w:themeColor="text1"/>
+        </w:rPr>
+        <w:t>test</w:t>
+      </w:r>
+      <w:proofErr w:type="gramEnd"/>
+      <w:r>
+        <w:rPr>
+          <w:color w:val="000000" w:themeColor="text1"/>
+        </w:rPr>
+        <w:t xml:space="preserve"> to be the best</w:t>
+      </w:r>
+      <w:r>
+        <w:rPr>
+          <w:color w:val="000000" w:themeColor="text1"/>
+        </w:rPr>
+        <w:t>.</w:t>
+      </w:r>
+    </w:p>
+    <w:p>
+      <w:pPr>
+        <w:pStyle w:val="Heading2"/>
+        <w:rPr>
+          <w:color w:val="000000" w:themeColor="text1"/>
+        </w:rPr>
+      </w:pPr>
+      <w:r>
+        <w:rPr>
+          <w:color w:val="000000" w:themeColor="text1"/>
+        </w:rPr>
+        <w:t>What We Tried That Didn't Work</w:t>
+      </w:r>
+    </w:p>
+    <w:p>
+      <w:pPr>
+        <w:rPr>
+          <w:color w:val="000000" w:themeColor="text1"/>
+        </w:rPr>
+      </w:pPr>
+      <w:r>
+        <w:rPr>
+          <w:color w:val="000000" w:themeColor="text1"/>
+        </w:rPr>
+        <w:t xml:space="preserve">The following approaches were tested and </w:t>
+      </w:r>
+      <w:r>
+        <w:rPr>
+          <w:color w:val="000000" w:themeColor="text1"/>
+        </w:rPr>
+        <w:t>later rejected before arriving at our final product due to certain constraints.</w:t>
+      </w:r>
+    </w:p>
+    <w:p>
+      <w:pPr>
+        <w:pStyle w:val="ListBullet"/>
+        <w:rPr>
+          <w:color w:val="000000" w:themeColor="text1"/>
+        </w:rPr>
+      </w:pPr>
+      <w:r>
+        <w:rPr>
+          <w:b/>
+          <w:color w:val="000000" w:themeColor="text1"/>
+        </w:rPr>
+        <w:t xml:space="preserve">Edge-count-only classification (no variance signal): </w:t>
+      </w:r>
+      <w:r>
+        <w:rPr>
+          <w:color w:val="000000" w:themeColor="text1"/>
+        </w:rPr>
+        <w:t xml:space="preserve">The initial </w:t>
+      </w:r>
+      <w:r>
+        <w:rPr>
+          <w:color w:val="000000" w:themeColor="text1"/>
+        </w:rPr>
+        <w:t>approach</w:t>
+      </w:r>
+      <w:r>
+        <w:rPr>
+          <w:color w:val="000000" w:themeColor="text1"/>
+        </w:rPr>
+        <w:t xml:space="preserve"> used only the Canny edge count. While this worked for high-contrast cars, it missed vehicles whose color matched the pavement surface </w:t>
+      </w:r>
+      <w:r>
+        <w:rPr>
+          <w:color w:val="000000" w:themeColor="text1"/>
+        </w:rPr>
+        <w:t>(gray</w:t>
+      </w:r>
+      <w:r>
+        <w:rPr>
+          <w:color w:val="000000" w:themeColor="text1"/>
+        </w:rPr>
+        <w:t xml:space="preserve"> cars on gray asphalt). Adding intensity standard deviation (</w:t>
+      </w:r>
+      <w:proofErr w:type="gramStart"/>
+      <w:r>
+        <w:rPr>
+          <w:color w:val="000000" w:themeColor="text1"/>
+        </w:rPr>
+        <w:t>cv::</w:t>
+      </w:r>
+      <w:proofErr w:type="gramEnd"/>
+      <w:r>
+        <w:rPr>
+          <w:color w:val="000000" w:themeColor="text1"/>
+        </w:rPr>
+        <w:t xml:space="preserve">meanStdDev) as a second signal and combining both with </w:t>
+      </w:r>
+      <w:proofErr w:type="gramStart"/>
+      <w:r>
+        <w:rPr>
+          <w:color w:val="000000" w:themeColor="text1"/>
+        </w:rPr>
+        <w:t>OR</w:t>
+      </w:r>
+      <w:proofErr w:type="gramEnd"/>
+      <w:r>
+        <w:rPr>
+          <w:color w:val="000000" w:themeColor="text1"/>
+        </w:rPr>
+        <w:t xml:space="preserve"> logic improved</w:t>
+      </w:r>
+      <w:r>
+        <w:rPr>
+          <w:color w:val="000000" w:themeColor="text1"/>
+        </w:rPr>
+        <w:t xml:space="preserve"> </w:t>
+      </w:r>
+      <w:r>
+        <w:rPr>
+          <w:color w:val="000000" w:themeColor="text1"/>
+        </w:rPr>
+        <w:t xml:space="preserve">without increasing false positives on the </w:t>
+      </w:r>
+      <w:r>
+        <w:rPr>
+          <w:color w:val="000000" w:themeColor="text1"/>
+        </w:rPr>
+        <w:t>reference</w:t>
+      </w:r>
+      <w:r>
+        <w:rPr>
+          <w:color w:val="000000" w:themeColor="text1"/>
+        </w:rPr>
+        <w:t xml:space="preserve"> image.</w:t>
+      </w:r>
+    </w:p>
+    <w:p>
+      <w:pPr>
+        <w:pStyle w:val="ListBullet"/>
+        <w:rPr>
+          <w:color w:val="000000" w:themeColor="text1"/>
+        </w:rPr>
+      </w:pPr>
+      <w:r>
+        <w:rPr>
+          <w:b/>
+          <w:color w:val="000000" w:themeColor="text1"/>
+        </w:rPr>
+        <w:t xml:space="preserve">RGB variance instead of grayscale variance: </w:t>
+      </w:r>
+      <w:proofErr w:type="gramStart"/>
+      <w:r>
+        <w:rPr>
+          <w:color w:val="000000" w:themeColor="text1"/>
+        </w:rPr>
+        <w:t>cv::</w:t>
+      </w:r>
+      <w:proofErr w:type="gramEnd"/>
+      <w:r>
+        <w:rPr>
+          <w:color w:val="000000" w:themeColor="text1"/>
+        </w:rPr>
+        <w:t xml:space="preserve">meanStdDev was initially applied to the original </w:t>
+      </w:r>
+      <w:r>
+        <w:rPr>
+          <w:color w:val="000000" w:themeColor="text1"/>
+        </w:rPr>
+        <w:t>RGB</w:t>
+      </w:r>
+      <w:r>
+        <w:rPr>
+          <w:color w:val="000000" w:themeColor="text1"/>
+        </w:rPr>
+        <w:t xml:space="preserve"> image to capture color variation as an additional occupancy signal. In practice, the </w:t>
+      </w:r>
+      <w:r>
+        <w:rPr>
+          <w:color w:val="000000" w:themeColor="text1"/>
+        </w:rPr>
+        <w:t xml:space="preserve">colorful </w:t>
+      </w:r>
+      <w:r>
+        <w:rPr>
+          <w:color w:val="000000" w:themeColor="text1"/>
+        </w:rPr>
+        <w:t xml:space="preserve">variance </w:t>
+      </w:r>
+      <w:r>
+        <w:rPr>
+          <w:color w:val="000000" w:themeColor="text1"/>
+        </w:rPr>
+        <w:t>was shown to have no</w:t>
+      </w:r>
+      <w:r>
+        <w:rPr>
+          <w:color w:val="000000" w:themeColor="text1"/>
+        </w:rPr>
+        <w:t xml:space="preserve"> gain over grayscale variance</w:t>
+      </w:r>
+      <w:r>
+        <w:rPr>
+          <w:color w:val="000000" w:themeColor="text1"/>
+        </w:rPr>
+        <w:t>.</w:t>
+      </w:r>
+      <w:r>
+        <w:rPr>
+          <w:color w:val="000000" w:themeColor="text1"/>
+        </w:rPr>
+        <w:t xml:space="preserve"> </w:t>
+      </w:r>
+      <w:r>
+        <w:rPr>
+          <w:color w:val="000000" w:themeColor="text1"/>
+        </w:rPr>
+        <w:t>T</w:t>
+      </w:r>
+      <w:r>
+        <w:rPr>
+          <w:color w:val="000000" w:themeColor="text1"/>
+        </w:rPr>
+        <w:t xml:space="preserve">he </w:t>
+      </w:r>
+      <w:r>
+        <w:rPr>
+          <w:color w:val="000000" w:themeColor="text1"/>
+        </w:rPr>
+        <w:t>bulk of the</w:t>
+      </w:r>
+      <w:r>
+        <w:rPr>
+          <w:color w:val="000000" w:themeColor="text1"/>
+        </w:rPr>
+        <w:t xml:space="preserve"> occupancy signals (shadow edges, windshield reflections, car body texture) are luminance-based rather than</w:t>
+      </w:r>
+      <w:r>
+        <w:rPr>
+          <w:color w:val="000000" w:themeColor="text1"/>
+        </w:rPr>
+        <w:t xml:space="preserve"> color-based, making RGB variance unhelpful</w:t>
+      </w:r>
+      <w:r>
+        <w:rPr>
+          <w:color w:val="000000" w:themeColor="text1"/>
+        </w:rPr>
+        <w:t>.</w:t>
+      </w:r>
+      <w:r>
+        <w:rPr>
+          <w:color w:val="000000" w:themeColor="text1"/>
+        </w:rPr>
+        <w:t xml:space="preserve"> In addition, it produced many more false positives in both the empty image and the test images.</w:t>
+      </w:r>
+      <w:r>
+        <w:rPr>
+          <w:color w:val="000000" w:themeColor="text1"/>
+        </w:rPr>
+        <w:t xml:space="preserve"> </w:t>
+      </w:r>
+    </w:p>
+    <w:p>
+      <w:pPr>
+        <w:pStyle w:val="ListBullet"/>
+        <w:rPr>
+          <w:color w:val="000000" w:themeColor="text1"/>
+        </w:rPr>
+      </w:pPr>
+      <w:r>
+        <w:rPr>
+          <w:b/>
+          <w:color w:val="000000" w:themeColor="text1"/>
+        </w:rPr>
+        <w:lastRenderedPageBreak/>
+        <w:t xml:space="preserve">Automatic ROI detection with Hough lines: </w:t>
+      </w:r>
+      <w:proofErr w:type="gramStart"/>
+      <w:r>
+        <w:rPr>
+          <w:color w:val="000000" w:themeColor="text1"/>
+        </w:rPr>
+        <w:t>cv::</w:t>
+      </w:r>
+      <w:proofErr w:type="gramEnd"/>
+      <w:r>
+        <w:rPr>
+          <w:color w:val="000000" w:themeColor="text1"/>
+        </w:rPr>
+        <w:t xml:space="preserve">HoughLinesP was tested to automatically detect painted space boundaries and derive polygon ROIs without manual tracing. </w:t>
+      </w:r>
+      <w:r>
+        <w:rPr>
+          <w:color w:val="000000" w:themeColor="text1"/>
+        </w:rPr>
+        <w:t xml:space="preserve">This was the first step of our project. However, the </w:t>
+      </w:r>
+      <w:r>
+        <w:rPr>
+          <w:color w:val="000000" w:themeColor="text1"/>
+        </w:rPr>
+        <w:t xml:space="preserve">painted lot lines were too faint and inconsistent across varying lighting conditions to produce </w:t>
+      </w:r>
+      <w:r>
+        <w:rPr>
+          <w:color w:val="000000" w:themeColor="text1"/>
+        </w:rPr>
+        <w:t>accurate parking-space detections. The p</w:t>
+      </w:r>
+      <w:r>
+        <w:rPr>
+          <w:color w:val="000000" w:themeColor="text1"/>
+        </w:rPr>
+        <w:t xml:space="preserve">erspective </w:t>
+      </w:r>
+      <w:r>
+        <w:rPr>
+          <w:color w:val="000000" w:themeColor="text1"/>
+        </w:rPr>
+        <w:t xml:space="preserve">of the security camera angles </w:t>
+      </w:r>
+      <w:r>
+        <w:rPr>
+          <w:color w:val="000000" w:themeColor="text1"/>
+        </w:rPr>
+        <w:t xml:space="preserve">made it difficult to assemble individual line segments into </w:t>
+      </w:r>
+      <w:r>
+        <w:rPr>
+          <w:color w:val="000000" w:themeColor="text1"/>
+        </w:rPr>
+        <w:t>quadrilaterals, resulting in many parking spaces being inconsistent (different sizes and shapes, with some missing)</w:t>
+      </w:r>
+      <w:r>
+        <w:rPr>
+          <w:color w:val="000000" w:themeColor="text1"/>
+        </w:rPr>
+        <w:t xml:space="preserve">. Manual tracing with the label tool was </w:t>
+      </w:r>
+      <w:r>
+        <w:rPr>
+          <w:color w:val="000000" w:themeColor="text1"/>
+        </w:rPr>
+        <w:t>used</w:t>
+      </w:r>
+      <w:r>
+        <w:rPr>
+          <w:color w:val="000000" w:themeColor="text1"/>
+        </w:rPr>
+        <w:t>,</w:t>
+      </w:r>
+      <w:r>
+        <w:rPr>
+          <w:color w:val="000000" w:themeColor="text1"/>
+        </w:rPr>
+        <w:t xml:space="preserve"> as we have a time constraint and our main goal is to detect occupancy</w:t>
+      </w:r>
+      <w:r>
+        <w:rPr>
+          <w:color w:val="000000" w:themeColor="text1"/>
+        </w:rPr>
+        <w:t>.</w:t>
+      </w:r>
+    </w:p>
+    <w:p>
+      <w:pPr>
+        <w:pStyle w:val="ListBullet"/>
+        <w:rPr>
+          <w:color w:val="000000" w:themeColor="text1"/>
+        </w:rPr>
+      </w:pPr>
+      <w:r>
+        <w:rPr>
+          <w:b/>
+          <w:color w:val="000000" w:themeColor="text1"/>
+        </w:rPr>
+        <w:t xml:space="preserve">Histogram-based classification: </w:t>
+      </w:r>
+      <w:r>
+        <w:rPr>
+          <w:color w:val="000000" w:themeColor="text1"/>
+        </w:rPr>
+        <w:t xml:space="preserve">Per-space color histograms (cv::calcHist) were compared against empty-reference histograms using cv::compareHist. Correlation and chi-square comparison metrics were not </w:t>
+      </w:r>
+      <w:r>
+        <w:rPr>
+          <w:color w:val="000000" w:themeColor="text1"/>
+        </w:rPr>
+        <w:t>poor</w:t>
+      </w:r>
+      <w:r>
+        <w:rPr>
+          <w:color w:val="000000" w:themeColor="text1"/>
+        </w:rPr>
+        <w:t xml:space="preserve"> across the </w:t>
+      </w:r>
+      <w:r>
+        <w:rPr>
+          <w:color w:val="000000" w:themeColor="text1"/>
+        </w:rPr>
+        <w:t>dataset's different lighting conditions</w:t>
+      </w:r>
+      <w:r>
+        <w:rPr>
+          <w:color w:val="000000" w:themeColor="text1"/>
+        </w:rPr>
+        <w:t xml:space="preserve">. </w:t>
+      </w:r>
+      <w:r>
+        <w:rPr>
+          <w:color w:val="000000" w:themeColor="text1"/>
+        </w:rPr>
+        <w:t xml:space="preserve"> </w:t>
+      </w:r>
+      <w:r>
+        <w:rPr>
+          <w:color w:val="000000" w:themeColor="text1"/>
+        </w:rPr>
+        <w:t>S</w:t>
+      </w:r>
+      <w:r>
+        <w:rPr>
+          <w:color w:val="000000" w:themeColor="text1"/>
+        </w:rPr>
+        <w:t>hadow and time-of-day shifts caused empty spaces to diverge from the reference histogram as much as occupied ones did.</w:t>
+      </w:r>
+    </w:p>
+    <w:p>
+      <w:pPr>
+        <w:pStyle w:val="ListBullet"/>
+        <w:rPr>
+          <w:color w:val="000000" w:themeColor="text1"/>
+        </w:rPr>
+      </w:pPr>
+      <w:r>
+        <w:rPr>
+          <w:b/>
+          <w:color w:val="000000" w:themeColor="text1"/>
+        </w:rPr>
+        <w:t xml:space="preserve">HOG features: </w:t>
+      </w:r>
+      <w:r>
+        <w:rPr>
+          <w:color w:val="000000" w:themeColor="text1"/>
+        </w:rPr>
+        <w:t xml:space="preserve">Histogram of Oriented Gradients was </w:t>
+      </w:r>
+      <w:r>
+        <w:rPr>
+          <w:color w:val="000000" w:themeColor="text1"/>
+        </w:rPr>
+        <w:t>something that seemed</w:t>
+      </w:r>
+      <w:r>
+        <w:rPr>
+          <w:color w:val="000000" w:themeColor="text1"/>
+        </w:rPr>
+        <w:t xml:space="preserve"> more structured</w:t>
+      </w:r>
+      <w:r>
+        <w:rPr>
+          <w:color w:val="000000" w:themeColor="text1"/>
+        </w:rPr>
+        <w:t>, an</w:t>
+      </w:r>
+      <w:r>
+        <w:rPr>
+          <w:color w:val="000000" w:themeColor="text1"/>
+        </w:rPr>
+        <w:t xml:space="preserve"> alternative to </w:t>
+      </w:r>
+      <w:r>
+        <w:rPr>
+          <w:color w:val="000000" w:themeColor="text1"/>
+        </w:rPr>
+        <w:t xml:space="preserve">the </w:t>
+      </w:r>
+      <w:r>
+        <w:rPr>
+          <w:color w:val="000000" w:themeColor="text1"/>
+        </w:rPr>
+        <w:t xml:space="preserve">Canny edge count. HOG is sensitive to local gradient orientation patterns that </w:t>
+      </w:r>
+      <w:r>
+        <w:rPr>
+          <w:color w:val="000000" w:themeColor="text1"/>
+        </w:rPr>
+        <w:t xml:space="preserve">go well with </w:t>
+      </w:r>
+      <w:r>
+        <w:rPr>
+          <w:color w:val="000000" w:themeColor="text1"/>
+        </w:rPr>
+        <w:t>vehicles</w:t>
+      </w:r>
+      <w:r>
+        <w:rPr>
+          <w:color w:val="000000" w:themeColor="text1"/>
+        </w:rPr>
+        <w:t>. However,</w:t>
+      </w:r>
+      <w:r>
+        <w:rPr>
+          <w:color w:val="000000" w:themeColor="text1"/>
+        </w:rPr>
+        <w:t xml:space="preserve"> computing HOG on </w:t>
+      </w:r>
+      <w:r>
+        <w:rPr>
+          <w:color w:val="000000" w:themeColor="text1"/>
+        </w:rPr>
+        <w:t>small, masked</w:t>
+      </w:r>
+      <w:r>
+        <w:rPr>
+          <w:color w:val="000000" w:themeColor="text1"/>
+        </w:rPr>
+        <w:t xml:space="preserve"> polygon regions produced noisy descriptors. Without </w:t>
+      </w:r>
+      <w:r>
+        <w:rPr>
+          <w:color w:val="000000" w:themeColor="text1"/>
+        </w:rPr>
+        <w:t>a trained classifier to compare the descriptors against, HOG was no better than simple edge-density counts and produced many false positives</w:t>
+      </w:r>
+      <w:r>
+        <w:rPr>
+          <w:color w:val="000000" w:themeColor="text1"/>
+        </w:rPr>
+        <w:t>.</w:t>
+      </w:r>
+    </w:p>
+    <w:p>
+      <w:pPr>
+        <w:pStyle w:val="ListBullet"/>
+        <w:rPr>
+          <w:color w:val="000000" w:themeColor="text1"/>
+        </w:rPr>
+      </w:pPr>
+      <w:r>
+        <w:rPr>
+          <w:b/>
+          <w:color w:val="000000" w:themeColor="text1"/>
+        </w:rPr>
+        <w:t xml:space="preserve">CLAHE preprocessing: </w:t>
+      </w:r>
+      <w:r>
+        <w:rPr>
+          <w:color w:val="000000" w:themeColor="text1"/>
+        </w:rPr>
+        <w:t>Contrast Limited Adaptive Histogram Equalization (cv::createCLAHE) was applied before edge detection to enhance low-contrast vehicles. CLAHE</w:t>
+      </w:r>
+      <w:r>
+        <w:rPr>
+          <w:color w:val="000000" w:themeColor="text1"/>
+        </w:rPr>
+        <w:t xml:space="preserve"> improved the visibility of faint car edges in some cases. It also amplified pavement texture and shadow detail, leading to a significant increase in</w:t>
+      </w:r>
+      <w:r>
+        <w:rPr>
+          <w:color w:val="000000" w:themeColor="text1"/>
+        </w:rPr>
+        <w:t xml:space="preserve"> the empty-space edge baseline. The higher thresholds </w:t>
+      </w:r>
+      <w:r>
+        <w:rPr>
+          <w:color w:val="000000" w:themeColor="text1"/>
+        </w:rPr>
+        <w:t>canceled</w:t>
+      </w:r>
+      <w:r>
+        <w:rPr>
+          <w:color w:val="000000" w:themeColor="text1"/>
+        </w:rPr>
+        <w:t xml:space="preserve"> out the </w:t>
+      </w:r>
+      <w:r>
+        <w:rPr>
+          <w:color w:val="000000" w:themeColor="text1"/>
+        </w:rPr>
+        <w:t xml:space="preserve">detection </w:t>
+      </w:r>
+      <w:r>
+        <w:rPr>
+          <w:color w:val="000000" w:themeColor="text1"/>
+        </w:rPr>
+        <w:t>improvement</w:t>
+      </w:r>
+      <w:r>
+        <w:rPr>
+          <w:color w:val="000000" w:themeColor="text1"/>
+        </w:rPr>
+        <w:t xml:space="preserve">, </w:t>
+      </w:r>
+      <w:proofErr w:type="gramStart"/>
+      <w:r>
+        <w:rPr>
+          <w:color w:val="000000" w:themeColor="text1"/>
+        </w:rPr>
+        <w:t>similar to</w:t>
+      </w:r>
+      <w:proofErr w:type="gramEnd"/>
+      <w:r>
+        <w:rPr>
+          <w:color w:val="000000" w:themeColor="text1"/>
+        </w:rPr>
+        <w:t xml:space="preserve"> lowering the canny.</w:t>
       </w:r>
     </w:p>
     <w:p>
@@ -2481,7 +4881,13 @@
         <w:rPr>
           <w:color w:val="000000" w:themeColor="text1"/>
         </w:rPr>
-        <w:t>7. Lessons Learned</w:t>
+        <w:t>6</w:t>
+      </w:r>
+      <w:r>
+        <w:rPr>
+          <w:color w:val="000000" w:themeColor="text1"/>
+        </w:rPr>
+        <w:t>. Lessons Learned</w:t>
       </w:r>
     </w:p>
     <w:p>
@@ -2495,7 +4901,31 @@
         <w:rPr>
           <w:color w:val="000000" w:themeColor="text1"/>
         </w:rPr>
-        <w:t>Accurate ROI placement is the most impactful factor. ROIs overlapping with painted lines or grass medians inflate edge counts significantly, making threshold calibration unreliable regardless of other parameter choices.</w:t>
+        <w:t xml:space="preserve">Accurate ROI placement is the most impactful factor. ROIs overlapping with painted lines or grass medians </w:t>
+      </w:r>
+      <w:r>
+        <w:rPr>
+          <w:color w:val="000000" w:themeColor="text1"/>
+        </w:rPr>
+        <w:t>inflate edge counts</w:t>
+      </w:r>
+      <w:r>
+        <w:rPr>
+          <w:color w:val="000000" w:themeColor="text1"/>
+        </w:rPr>
+        <w:t xml:space="preserve">, making threshold </w:t>
+      </w:r>
+      <w:r>
+        <w:rPr>
+          <w:color w:val="000000" w:themeColor="text1"/>
+        </w:rPr>
+        <w:t>calculation</w:t>
+      </w:r>
+      <w:r>
+        <w:rPr>
+          <w:color w:val="000000" w:themeColor="text1"/>
+        </w:rPr>
+        <w:t xml:space="preserve"> unreliable regardless of other parameter choices.</w:t>
       </w:r>
     </w:p>
     <w:p>
@@ -2523,7 +4953,19 @@
         <w:rPr>
           <w:color w:val="000000" w:themeColor="text1"/>
         </w:rPr>
-        <w:t>Combining two independent signals (edge density + intensity variance with OR logic) meaningfully improves recall over single-signal classification without increasing false positives on the calibration image.</w:t>
+        <w:t xml:space="preserve">Combining two independent signals (edge density + intensity variance with OR logic) improves </w:t>
+      </w:r>
+      <w:r>
+        <w:rPr>
+          <w:color w:val="000000" w:themeColor="text1"/>
+        </w:rPr>
+        <w:t>detection</w:t>
+      </w:r>
+      <w:r>
+        <w:rPr>
+          <w:color w:val="000000" w:themeColor="text1"/>
+        </w:rPr>
+        <w:t xml:space="preserve"> over single-signal classification without increasing false positives on the calibration image.</w:t>
       </w:r>
     </w:p>
     <w:p>
@@ -2552,7 +4994,13 @@
           <w:color w:val="000000" w:themeColor="text1"/>
         </w:rPr>
         <w:lastRenderedPageBreak/>
-        <w:t>8. Future Work</w:t>
+        <w:t>7</w:t>
+      </w:r>
+      <w:r>
+        <w:rPr>
+          <w:color w:val="000000" w:themeColor="text1"/>
+        </w:rPr>
+        <w:t>. Future Work</w:t>
       </w:r>
     </w:p>
     <w:p>
@@ -2566,7 +5014,31 @@
         <w:rPr>
           <w:color w:val="000000" w:themeColor="text1"/>
         </w:rPr>
-        <w:t>Implement automatic ROI detection using Hough line transform to identify painted space boundaries without manual tracing, enabling the system to generalize to unseen lots.</w:t>
+        <w:t>Make a pivot (</w:t>
+      </w:r>
+      <w:r>
+        <w:rPr>
+          <w:color w:val="000000" w:themeColor="text1"/>
+        </w:rPr>
+        <w:t>while keeping</w:t>
+      </w:r>
+      <w:r>
+        <w:rPr>
+          <w:color w:val="000000" w:themeColor="text1"/>
+        </w:rPr>
+        <w:t xml:space="preserve"> the project mainly on OpenCV and C++) to </w:t>
+      </w:r>
+      <w:r>
+        <w:rPr>
+          <w:color w:val="000000" w:themeColor="text1"/>
+        </w:rPr>
+        <w:t>work</w:t>
+      </w:r>
+      <w:r>
+        <w:rPr>
+          <w:color w:val="000000" w:themeColor="text1"/>
+        </w:rPr>
+        <w:t xml:space="preserve"> with indoor parking, so lighting and pavement will be consistent, allowing ease of automatic ROI, and improvement in the detection itself. </w:t>
       </w:r>
     </w:p>
     <w:p>
@@ -2580,7 +5052,19 @@
         <w:rPr>
           <w:color w:val="000000" w:themeColor="text1"/>
         </w:rPr>
-        <w:t>Explore background subtraction using a registered empty-lot reference frame to eliminate false positives caused by pavement texture and shadow.</w:t>
+        <w:t>Implement automatic ROI detection</w:t>
+      </w:r>
+      <w:r>
+        <w:rPr>
+          <w:color w:val="000000" w:themeColor="text1"/>
+        </w:rPr>
+        <w:t xml:space="preserve"> so the detection program can be used on any new set of parking lots</w:t>
+      </w:r>
+      <w:r>
+        <w:rPr>
+          <w:color w:val="000000" w:themeColor="text1"/>
+        </w:rPr>
+        <w:t>.</w:t>
       </w:r>
     </w:p>
     <w:p>
@@ -2594,7 +5078,13 @@
         <w:rPr>
           <w:color w:val="000000" w:themeColor="text1"/>
         </w:rPr>
-        <w:t>Extend to live video input using cv::VideoCapture for real-time occupancy monitoring with FPS counter overlay.</w:t>
+        <w:t>Find</w:t>
+      </w:r>
+      <w:r>
+        <w:rPr>
+          <w:color w:val="000000" w:themeColor="text1"/>
+        </w:rPr>
+        <w:t xml:space="preserve"> background subtraction using a registered empty-lot reference frame to eliminate false positives caused by pavement texture and shadow.</w:t>
       </w:r>
     </w:p>
     <w:p>
@@ -2608,7 +5098,109 @@
         <w:rPr>
           <w:color w:val="000000" w:themeColor="text1"/>
         </w:rPr>
-        <w:t>Investigate lightweight ML classifiers (e.g., SVM on HOG features) as a higher-accuracy drop-in replacement for the threshold-based classifier.</w:t>
+        <w:t>Utilize contours as a third signal (</w:t>
+      </w:r>
+      <w:proofErr w:type="gramStart"/>
+      <w:r>
+        <w:rPr>
+          <w:color w:val="000000" w:themeColor="text1"/>
+        </w:rPr>
+        <w:t>cv::</w:t>
+      </w:r>
+      <w:proofErr w:type="spellStart"/>
+      <w:proofErr w:type="gramEnd"/>
+      <w:r>
+        <w:rPr>
+          <w:color w:val="000000" w:themeColor="text1"/>
+        </w:rPr>
+        <w:t>findContours</w:t>
+      </w:r>
+      <w:proofErr w:type="spellEnd"/>
+      <w:r>
+        <w:rPr>
+          <w:color w:val="000000" w:themeColor="text1"/>
+        </w:rPr>
+        <w:t xml:space="preserve">), as vehicles will most likely produce long connected lines, which can be used to classify as a vehicle when the other two signals don’t work. </w:t>
+      </w:r>
+    </w:p>
+    <w:p>
+      <w:pPr>
+        <w:pStyle w:val="ListBullet"/>
+        <w:rPr>
+          <w:color w:val="000000" w:themeColor="text1"/>
+        </w:rPr>
+      </w:pPr>
+      <w:r>
+        <w:rPr>
+          <w:color w:val="000000" w:themeColor="text1"/>
+        </w:rPr>
+        <w:t xml:space="preserve">Extend to live video input using </w:t>
+      </w:r>
+      <w:proofErr w:type="gramStart"/>
+      <w:r>
+        <w:rPr>
+          <w:color w:val="000000" w:themeColor="text1"/>
+        </w:rPr>
+        <w:t>cv::</w:t>
+      </w:r>
+      <w:proofErr w:type="gramEnd"/>
+      <w:r>
+        <w:rPr>
+          <w:color w:val="000000" w:themeColor="text1"/>
+        </w:rPr>
+        <w:t>VideoCapture for real-time occupancy monitoring.</w:t>
+      </w:r>
+    </w:p>
+    <w:p>
+      <w:pPr>
+        <w:pStyle w:val="ListBullet"/>
+        <w:rPr>
+          <w:color w:val="000000" w:themeColor="text1"/>
+        </w:rPr>
+      </w:pPr>
+      <w:r>
+        <w:rPr>
+          <w:color w:val="000000" w:themeColor="text1"/>
+        </w:rPr>
+        <w:t>Utilizing</w:t>
+      </w:r>
+      <w:r>
+        <w:rPr>
+          <w:color w:val="000000" w:themeColor="text1"/>
+        </w:rPr>
+        <w:t xml:space="preserve"> lightweight ML classifiers (SVM on HOG features) as a higher-accuracy replacement for the </w:t>
+      </w:r>
+      <w:r>
+        <w:rPr>
+          <w:color w:val="000000" w:themeColor="text1"/>
+        </w:rPr>
+        <w:t xml:space="preserve">current </w:t>
+      </w:r>
+      <w:r>
+        <w:rPr>
+          <w:color w:val="000000" w:themeColor="text1"/>
+        </w:rPr>
+        <w:t>threshold-based classifier.</w:t>
+      </w:r>
+      <w:r>
+        <w:rPr>
+          <w:color w:val="000000" w:themeColor="text1"/>
+        </w:rPr>
+        <w:t xml:space="preserve"> This approach, however, steers </w:t>
+      </w:r>
+      <w:proofErr w:type="gramStart"/>
+      <w:r>
+        <w:rPr>
+          <w:color w:val="000000" w:themeColor="text1"/>
+        </w:rPr>
+        <w:t>off of</w:t>
+      </w:r>
+      <w:proofErr w:type="gramEnd"/>
+      <w:r>
+        <w:rPr>
+          <w:color w:val="000000" w:themeColor="text1"/>
+        </w:rPr>
+        <w:t xml:space="preserve"> OpenCV and C++ practices, which is why we did not go with it. </w:t>
       </w:r>
     </w:p>
     <w:sectPr>
@@ -2794,31 +5386,31 @@
       </w:rPr>
     </w:lvl>
   </w:abstractNum>
-  <w:num w:numId="1" w16cid:durableId="409543471">
+  <w:num w:numId="1" w16cid:durableId="529533630">
     <w:abstractNumId w:val="8"/>
   </w:num>
-  <w:num w:numId="2" w16cid:durableId="205027518">
+  <w:num w:numId="2" w16cid:durableId="451365880">
     <w:abstractNumId w:val="6"/>
   </w:num>
-  <w:num w:numId="3" w16cid:durableId="638998469">
+  <w:num w:numId="3" w16cid:durableId="53626440">
     <w:abstractNumId w:val="5"/>
   </w:num>
-  <w:num w:numId="4" w16cid:durableId="944968961">
+  <w:num w:numId="4" w16cid:durableId="515538335">
     <w:abstractNumId w:val="4"/>
   </w:num>
-  <w:num w:numId="5" w16cid:durableId="2053261788">
+  <w:num w:numId="5" w16cid:durableId="336810210">
     <w:abstractNumId w:val="7"/>
   </w:num>
-  <w:num w:numId="6" w16cid:durableId="2121139742">
+  <w:num w:numId="6" w16cid:durableId="1698658478">
     <w:abstractNumId w:val="3"/>
   </w:num>
-  <w:num w:numId="7" w16cid:durableId="80759168">
+  <w:num w:numId="7" w16cid:durableId="2032757633">
     <w:abstractNumId w:val="2"/>
   </w:num>
-  <w:num w:numId="8" w16cid:durableId="1192382264">
+  <w:num w:numId="8" w16cid:durableId="1053652571">
     <w:abstractNumId w:val="1"/>
   </w:num>
-  <w:num w:numId="9" w16cid:durableId="997804611">
+  <w:num w:numId="9" w16cid:durableId="222102733">
     <w:abstractNumId w:val="0"/>
   </w:num>
 </w:numbering>
@@ -3430,7 +6022,6 @@
   <w:style w:type="character" w:default="1" w:styleId="DefaultParagraphFont">
     <w:name w:val="Default Paragraph Font"/>
     <w:uiPriority w:val="1"/>
-    <w:semiHidden/>
     <w:unhideWhenUsed/>
   </w:style>
   <w:style w:type="table" w:default="1" w:styleId="TableNormal">

</xml_diff>